<commit_message>
Update KHDH Tin hoc & Robotics, KHTCM THCS, and Lịch báo giảng
</commit_message>
<xml_diff>
--- a/Hệ thống mẫu văn bản/Nguyên đã làm/Kế hoạch dạy học Tin học từng lớp/Kế hoạch dạy học môn Tin học - Lớp 7 - 2026 - 2027.docx
+++ b/Hệ thống mẫu văn bản/Nguyên đã làm/Kế hoạch dạy học Tin học từng lớp/Kế hoạch dạy học môn Tin học - Lớp 7 - 2026 - 2027.docx
@@ -1365,6 +1365,2679 @@
         <w:t>Kế hoạch dạy học</w:t>
       </w:r>
     </w:p>
+    <w:tbl>
+      <w:tblPr>
+        <w:tblW w:type="auto" w:w="0"/>
+        <w:jc w:val="center"/>
+        <w:tblLook w:firstColumn="1" w:firstRow="1" w:lastColumn="0" w:lastRow="0" w:noHBand="0" w:noVBand="1" w:val="04A0"/>
+        <w:tblBorders>
+          <w:top w:val="single" w:sz="4" w:space="0" w:color="000000"/>
+          <w:left w:val="single" w:sz="4" w:space="0" w:color="000000"/>
+          <w:bottom w:val="single" w:sz="4" w:space="0" w:color="000000"/>
+          <w:right w:val="single" w:sz="4" w:space="0" w:color="000000"/>
+          <w:insideH w:val="single" w:sz="4" w:space="0" w:color="000000"/>
+          <w:insideV w:val="single" w:sz="4" w:space="0" w:color="000000"/>
+        </w:tblBorders>
+      </w:tblPr>
+      <w:tblGrid>
+        <w:gridCol w:w="1862"/>
+        <w:gridCol w:w="1862"/>
+        <w:gridCol w:w="1862"/>
+        <w:gridCol w:w="1862"/>
+        <w:gridCol w:w="1862"/>
+      </w:tblGrid>
+      <w:tr>
+        <w:tc>
+          <w:tcPr>
+            <w:tcW w:type="dxa" w:w="680"/>
+            <w:vAlign w:val="center"/>
+          </w:tcPr>
+          <w:p>
+            <w:pPr>
+              <w:spacing w:before="40" w:after="40" w:line="276" w:lineRule="auto"/>
+              <w:jc w:val="center"/>
+            </w:pPr>
+            <w:r>
+              <w:rPr>
+                <w:rFonts w:ascii="Times New Roman" w:hAnsi="Times New Roman"/>
+                <w:b/>
+                <w:sz w:val="26"/>
+                <w:rFonts w:ascii="Times New Roman" w:hAnsi="Times New Roman" w:cs="Times New Roman"/>
+              </w:rPr>
+              <w:t>STT</w:t>
+            </w:r>
+          </w:p>
+        </w:tc>
+        <w:tc>
+          <w:tcPr>
+            <w:tcW w:type="dxa" w:w="3118"/>
+            <w:vAlign w:val="center"/>
+          </w:tcPr>
+          <w:p>
+            <w:pPr>
+              <w:spacing w:before="40" w:after="40" w:line="276" w:lineRule="auto"/>
+              <w:jc w:val="left"/>
+            </w:pPr>
+            <w:r>
+              <w:rPr>
+                <w:rFonts w:ascii="Times New Roman" w:hAnsi="Times New Roman"/>
+                <w:b/>
+                <w:sz w:val="26"/>
+                <w:rFonts w:ascii="Times New Roman" w:hAnsi="Times New Roman" w:cs="Times New Roman"/>
+              </w:rPr>
+              <w:t>Bài học (1)</w:t>
+            </w:r>
+          </w:p>
+        </w:tc>
+        <w:tc>
+          <w:tcPr>
+            <w:tcW w:type="dxa" w:w="850"/>
+            <w:vAlign w:val="center"/>
+          </w:tcPr>
+          <w:p>
+            <w:pPr>
+              <w:spacing w:before="40" w:after="40" w:line="276" w:lineRule="auto"/>
+              <w:jc w:val="center"/>
+            </w:pPr>
+            <w:r>
+              <w:rPr>
+                <w:rFonts w:ascii="Times New Roman" w:hAnsi="Times New Roman"/>
+                <w:b/>
+                <w:sz w:val="26"/>
+                <w:rFonts w:ascii="Times New Roman" w:hAnsi="Times New Roman" w:cs="Times New Roman"/>
+              </w:rPr>
+              <w:t>Số tiết (2)</w:t>
+            </w:r>
+          </w:p>
+        </w:tc>
+        <w:tc>
+          <w:tcPr>
+            <w:tcW w:type="dxa" w:w="1247"/>
+            <w:vAlign w:val="center"/>
+          </w:tcPr>
+          <w:p>
+            <w:pPr>
+              <w:spacing w:before="40" w:after="40" w:line="276" w:lineRule="auto"/>
+              <w:jc w:val="center"/>
+            </w:pPr>
+            <w:r>
+              <w:rPr>
+                <w:rFonts w:ascii="Times New Roman" w:hAnsi="Times New Roman"/>
+                <w:b/>
+                <w:sz w:val="26"/>
+                <w:rFonts w:ascii="Times New Roman" w:hAnsi="Times New Roman" w:cs="Times New Roman"/>
+              </w:rPr>
+              <w:t>Tiết theo PPCT</w:t>
+            </w:r>
+          </w:p>
+        </w:tc>
+        <w:tc>
+          <w:tcPr>
+            <w:tcW w:type="dxa" w:w="3402"/>
+            <w:vAlign w:val="center"/>
+          </w:tcPr>
+          <w:p>
+            <w:pPr>
+              <w:spacing w:before="40" w:after="40" w:line="276" w:lineRule="auto"/>
+              <w:jc w:val="left"/>
+            </w:pPr>
+            <w:r>
+              <w:rPr>
+                <w:rFonts w:ascii="Times New Roman" w:hAnsi="Times New Roman"/>
+                <w:b/>
+                <w:sz w:val="26"/>
+                <w:rFonts w:ascii="Times New Roman" w:hAnsi="Times New Roman" w:cs="Times New Roman"/>
+              </w:rPr>
+              <w:t>Yêu cầu cần đạt (3)</w:t>
+            </w:r>
+          </w:p>
+        </w:tc>
+      </w:tr>
+      <w:tr>
+        <w:tc>
+          <w:tcPr>
+            <w:tcW w:type="dxa" w:w="680"/>
+            <w:vAlign w:val="center"/>
+          </w:tcPr>
+          <w:p>
+            <w:pPr>
+              <w:spacing w:before="40" w:after="40" w:line="276" w:lineRule="auto"/>
+              <w:jc w:val="center"/>
+            </w:pPr>
+            <w:r>
+              <w:rPr>
+                <w:rFonts w:ascii="Times New Roman" w:hAnsi="Times New Roman"/>
+                <w:sz w:val="26"/>
+                <w:rFonts w:ascii="Times New Roman" w:hAnsi="Times New Roman" w:cs="Times New Roman"/>
+              </w:rPr>
+              <w:t>1</w:t>
+            </w:r>
+          </w:p>
+        </w:tc>
+        <w:tc>
+          <w:tcPr>
+            <w:tcW w:type="dxa" w:w="3118"/>
+            <w:vAlign w:val="center"/>
+          </w:tcPr>
+          <w:p>
+            <w:pPr>
+              <w:spacing w:before="40" w:after="40" w:line="276" w:lineRule="auto"/>
+              <w:jc w:val="both"/>
+            </w:pPr>
+            <w:r>
+              <w:rPr>
+                <w:rFonts w:ascii="Times New Roman" w:hAnsi="Times New Roman"/>
+                <w:sz w:val="26"/>
+                <w:rFonts w:ascii="Times New Roman" w:hAnsi="Times New Roman" w:cs="Times New Roman"/>
+              </w:rPr>
+              <w:t>Tiết 0: Định hướng môn học</w:t>
+            </w:r>
+          </w:p>
+        </w:tc>
+        <w:tc>
+          <w:tcPr>
+            <w:tcW w:type="dxa" w:w="850"/>
+            <w:vAlign w:val="center"/>
+          </w:tcPr>
+          <w:p>
+            <w:pPr>
+              <w:spacing w:before="40" w:after="40" w:line="276" w:lineRule="auto"/>
+              <w:jc w:val="center"/>
+            </w:pPr>
+            <w:r>
+              <w:rPr>
+                <w:rFonts w:ascii="Times New Roman" w:hAnsi="Times New Roman"/>
+                <w:sz w:val="26"/>
+                <w:rFonts w:ascii="Times New Roman" w:hAnsi="Times New Roman" w:cs="Times New Roman"/>
+              </w:rPr>
+              <w:t>1</w:t>
+            </w:r>
+          </w:p>
+        </w:tc>
+        <w:tc>
+          <w:tcPr>
+            <w:tcW w:type="dxa" w:w="1247"/>
+            <w:vAlign w:val="center"/>
+          </w:tcPr>
+          <w:p>
+            <w:pPr>
+              <w:spacing w:before="40" w:after="40" w:line="276" w:lineRule="auto"/>
+              <w:jc w:val="center"/>
+            </w:pPr>
+            <w:r>
+              <w:rPr>
+                <w:rFonts w:ascii="Times New Roman" w:hAnsi="Times New Roman"/>
+                <w:sz w:val="26"/>
+                <w:rFonts w:ascii="Times New Roman" w:hAnsi="Times New Roman" w:cs="Times New Roman"/>
+              </w:rPr>
+              <w:t>1</w:t>
+            </w:r>
+          </w:p>
+        </w:tc>
+        <w:tc>
+          <w:tcPr>
+            <w:tcW w:type="dxa" w:w="3402"/>
+            <w:vAlign w:val="center"/>
+          </w:tcPr>
+          <w:p>
+            <w:pPr>
+              <w:spacing w:before="40" w:after="40" w:line="276" w:lineRule="auto"/>
+              <w:jc w:val="both"/>
+            </w:pPr>
+            <w:r>
+              <w:rPr>
+                <w:rFonts w:ascii="Times New Roman" w:hAnsi="Times New Roman"/>
+                <w:sz w:val="26"/>
+                <w:rFonts w:ascii="Times New Roman" w:hAnsi="Times New Roman" w:cs="Times New Roman"/>
+              </w:rPr>
+              <w:t>Giới thiệu tổng quan môn học Tin học, phương pháp học tập hiệu quả, các quy định an toàn và nội quy phòng học bộ môn.</w:t>
+            </w:r>
+          </w:p>
+        </w:tc>
+      </w:tr>
+      <w:tr>
+        <w:tc>
+          <w:tcPr>
+            <w:tcW w:type="dxa" w:w="9310"/>
+            <w:gridSpan w:val="5"/>
+            <w:vAlign w:val="center"/>
+          </w:tcPr>
+          <w:p>
+            <w:pPr>
+              <w:spacing w:before="40" w:after="40" w:line="276" w:lineRule="auto"/>
+              <w:jc w:val="both"/>
+            </w:pPr>
+            <w:r>
+              <w:rPr>
+                <w:rFonts w:ascii="Times New Roman" w:hAnsi="Times New Roman"/>
+                <w:b/>
+                <w:sz w:val="26"/>
+                <w:rFonts w:ascii="Times New Roman" w:hAnsi="Times New Roman" w:cs="Times New Roman"/>
+              </w:rPr>
+              <w:t>Chủ đề 1: Máy tính và cộng đồng</w:t>
+            </w:r>
+          </w:p>
+        </w:tc>
+      </w:tr>
+      <w:tr>
+        <w:tc>
+          <w:tcPr>
+            <w:tcW w:type="dxa" w:w="680"/>
+            <w:vAlign w:val="center"/>
+          </w:tcPr>
+          <w:p>
+            <w:pPr>
+              <w:spacing w:before="40" w:after="40" w:line="276" w:lineRule="auto"/>
+              <w:jc w:val="center"/>
+            </w:pPr>
+            <w:r>
+              <w:rPr>
+                <w:rFonts w:ascii="Times New Roman" w:hAnsi="Times New Roman"/>
+                <w:sz w:val="26"/>
+                <w:rFonts w:ascii="Times New Roman" w:hAnsi="Times New Roman" w:cs="Times New Roman"/>
+              </w:rPr>
+              <w:t>2</w:t>
+            </w:r>
+          </w:p>
+        </w:tc>
+        <w:tc>
+          <w:tcPr>
+            <w:tcW w:type="dxa" w:w="3118"/>
+            <w:vAlign w:val="center"/>
+          </w:tcPr>
+          <w:p>
+            <w:pPr>
+              <w:spacing w:before="40" w:after="40" w:line="276" w:lineRule="auto"/>
+              <w:jc w:val="both"/>
+            </w:pPr>
+            <w:r>
+              <w:rPr>
+                <w:rFonts w:ascii="Times New Roman" w:hAnsi="Times New Roman"/>
+                <w:sz w:val="26"/>
+                <w:rFonts w:ascii="Times New Roman" w:hAnsi="Times New Roman" w:cs="Times New Roman"/>
+              </w:rPr>
+              <w:t>Bài 1. Thiết bị vào - ra</w:t>
+            </w:r>
+          </w:p>
+        </w:tc>
+        <w:tc>
+          <w:tcPr>
+            <w:tcW w:type="dxa" w:w="850"/>
+            <w:vAlign w:val="center"/>
+          </w:tcPr>
+          <w:p>
+            <w:pPr>
+              <w:spacing w:before="40" w:after="40" w:line="276" w:lineRule="auto"/>
+              <w:jc w:val="center"/>
+            </w:pPr>
+            <w:r>
+              <w:rPr>
+                <w:rFonts w:ascii="Times New Roman" w:hAnsi="Times New Roman"/>
+                <w:sz w:val="26"/>
+                <w:rFonts w:ascii="Times New Roman" w:hAnsi="Times New Roman" w:cs="Times New Roman"/>
+              </w:rPr>
+              <w:t>1</w:t>
+            </w:r>
+          </w:p>
+        </w:tc>
+        <w:tc>
+          <w:tcPr>
+            <w:tcW w:type="dxa" w:w="1247"/>
+            <w:vAlign w:val="center"/>
+          </w:tcPr>
+          <w:p>
+            <w:pPr>
+              <w:spacing w:before="40" w:after="40" w:line="276" w:lineRule="auto"/>
+              <w:jc w:val="center"/>
+            </w:pPr>
+            <w:r>
+              <w:rPr>
+                <w:rFonts w:ascii="Times New Roman" w:hAnsi="Times New Roman"/>
+                <w:sz w:val="26"/>
+                <w:rFonts w:ascii="Times New Roman" w:hAnsi="Times New Roman" w:cs="Times New Roman"/>
+              </w:rPr>
+              <w:t>2</w:t>
+            </w:r>
+          </w:p>
+        </w:tc>
+        <w:tc>
+          <w:tcPr>
+            <w:tcW w:type="dxa" w:w="3402"/>
+            <w:vAlign w:val="center"/>
+          </w:tcPr>
+          <w:p>
+            <w:pPr>
+              <w:spacing w:before="40" w:after="40" w:line="276" w:lineRule="auto"/>
+              <w:jc w:val="both"/>
+            </w:pPr>
+            <w:r>
+              <w:rPr>
+                <w:rFonts w:ascii="Times New Roman" w:hAnsi="Times New Roman"/>
+                <w:sz w:val="26"/>
+                <w:rFonts w:ascii="Times New Roman" w:hAnsi="Times New Roman" w:cs="Times New Roman"/>
+              </w:rPr>
+              <w:t>- Củng cố, phát triển kiến thức xử lý thông tin.  - Nhận biết thiết bị vào - ra có nhiều loại/hình dạng; hiểu chức năng trong thu nhận, lưu trữ, xử lý, truyền thông tin.  - Nêu ví dụ về thao tác không đúng cách gây lỗi thiết bị.</w:t>
+            </w:r>
+          </w:p>
+        </w:tc>
+      </w:tr>
+      <w:tr>
+        <w:tc>
+          <w:tcPr>
+            <w:tcW w:type="dxa" w:w="680"/>
+            <w:vAlign w:val="center"/>
+          </w:tcPr>
+          <w:p>
+            <w:pPr>
+              <w:spacing w:before="40" w:after="40" w:line="276" w:lineRule="auto"/>
+              <w:jc w:val="center"/>
+            </w:pPr>
+            <w:r>
+              <w:rPr>
+                <w:rFonts w:ascii="Times New Roman" w:hAnsi="Times New Roman"/>
+                <w:sz w:val="26"/>
+                <w:rFonts w:ascii="Times New Roman" w:hAnsi="Times New Roman" w:cs="Times New Roman"/>
+              </w:rPr>
+              <w:t>3</w:t>
+            </w:r>
+          </w:p>
+        </w:tc>
+        <w:tc>
+          <w:tcPr>
+            <w:tcW w:type="dxa" w:w="3118"/>
+            <w:vAlign w:val="center"/>
+          </w:tcPr>
+          <w:p>
+            <w:pPr>
+              <w:spacing w:before="40" w:after="40" w:line="276" w:lineRule="auto"/>
+              <w:jc w:val="both"/>
+            </w:pPr>
+            <w:r>
+              <w:rPr>
+                <w:rFonts w:ascii="Times New Roman" w:hAnsi="Times New Roman"/>
+                <w:sz w:val="26"/>
+                <w:rFonts w:ascii="Times New Roman" w:hAnsi="Times New Roman" w:cs="Times New Roman"/>
+              </w:rPr>
+              <w:t>Bài 2. Phần mềm máy tính</w:t>
+            </w:r>
+          </w:p>
+        </w:tc>
+        <w:tc>
+          <w:tcPr>
+            <w:tcW w:type="dxa" w:w="850"/>
+            <w:vAlign w:val="center"/>
+          </w:tcPr>
+          <w:p>
+            <w:pPr>
+              <w:spacing w:before="40" w:after="40" w:line="276" w:lineRule="auto"/>
+              <w:jc w:val="center"/>
+            </w:pPr>
+            <w:r>
+              <w:rPr>
+                <w:rFonts w:ascii="Times New Roman" w:hAnsi="Times New Roman"/>
+                <w:sz w:val="26"/>
+                <w:rFonts w:ascii="Times New Roman" w:hAnsi="Times New Roman" w:cs="Times New Roman"/>
+              </w:rPr>
+              <w:t>1</w:t>
+            </w:r>
+          </w:p>
+        </w:tc>
+        <w:tc>
+          <w:tcPr>
+            <w:tcW w:type="dxa" w:w="1247"/>
+            <w:vAlign w:val="center"/>
+          </w:tcPr>
+          <w:p>
+            <w:pPr>
+              <w:spacing w:before="40" w:after="40" w:line="276" w:lineRule="auto"/>
+              <w:jc w:val="center"/>
+            </w:pPr>
+            <w:r>
+              <w:rPr>
+                <w:rFonts w:ascii="Times New Roman" w:hAnsi="Times New Roman"/>
+                <w:sz w:val="26"/>
+                <w:rFonts w:ascii="Times New Roman" w:hAnsi="Times New Roman" w:cs="Times New Roman"/>
+              </w:rPr>
+              <w:t>3</w:t>
+            </w:r>
+          </w:p>
+        </w:tc>
+        <w:tc>
+          <w:tcPr>
+            <w:tcW w:type="dxa" w:w="3402"/>
+            <w:vAlign w:val="center"/>
+          </w:tcPr>
+          <w:p>
+            <w:pPr>
+              <w:spacing w:before="40" w:after="40" w:line="276" w:lineRule="auto"/>
+              <w:jc w:val="both"/>
+            </w:pPr>
+            <w:r>
+              <w:rPr>
+                <w:rFonts w:ascii="Times New Roman" w:hAnsi="Times New Roman"/>
+                <w:sz w:val="26"/>
+                <w:rFonts w:ascii="Times New Roman" w:hAnsi="Times New Roman" w:cs="Times New Roman"/>
+              </w:rPr>
+              <w:t>- Nhận thức vai trò của phần mềm trong hoạt động của máy tính.  - Phân loại phần mềm thành: hệ điều hành và phần mềm ứng dụng.</w:t>
+            </w:r>
+          </w:p>
+        </w:tc>
+      </w:tr>
+      <w:tr>
+        <w:tc>
+          <w:tcPr>
+            <w:tcW w:type="dxa" w:w="680"/>
+            <w:vAlign w:val="center"/>
+          </w:tcPr>
+          <w:p>
+            <w:pPr>
+              <w:spacing w:before="40" w:after="40" w:line="276" w:lineRule="auto"/>
+              <w:jc w:val="center"/>
+            </w:pPr>
+            <w:r>
+              <w:rPr>
+                <w:rFonts w:ascii="Times New Roman" w:hAnsi="Times New Roman"/>
+                <w:sz w:val="26"/>
+                <w:rFonts w:ascii="Times New Roman" w:hAnsi="Times New Roman" w:cs="Times New Roman"/>
+              </w:rPr>
+              <w:t>4</w:t>
+            </w:r>
+          </w:p>
+        </w:tc>
+        <w:tc>
+          <w:tcPr>
+            <w:tcW w:type="dxa" w:w="3118"/>
+            <w:vAlign w:val="center"/>
+          </w:tcPr>
+          <w:p>
+            <w:pPr>
+              <w:spacing w:before="40" w:after="40" w:line="276" w:lineRule="auto"/>
+              <w:jc w:val="both"/>
+            </w:pPr>
+            <w:r>
+              <w:rPr>
+                <w:rFonts w:ascii="Times New Roman" w:hAnsi="Times New Roman"/>
+                <w:sz w:val="26"/>
+                <w:rFonts w:ascii="Times New Roman" w:hAnsi="Times New Roman" w:cs="Times New Roman"/>
+              </w:rPr>
+              <w:t>Bài 3. Quản lý dữ liệu trong máy tính</w:t>
+            </w:r>
+          </w:p>
+        </w:tc>
+        <w:tc>
+          <w:tcPr>
+            <w:tcW w:type="dxa" w:w="850"/>
+            <w:vAlign w:val="center"/>
+          </w:tcPr>
+          <w:p>
+            <w:pPr>
+              <w:spacing w:before="40" w:after="40" w:line="276" w:lineRule="auto"/>
+              <w:jc w:val="center"/>
+            </w:pPr>
+            <w:r>
+              <w:rPr>
+                <w:rFonts w:ascii="Times New Roman" w:hAnsi="Times New Roman"/>
+                <w:sz w:val="26"/>
+                <w:rFonts w:ascii="Times New Roman" w:hAnsi="Times New Roman" w:cs="Times New Roman"/>
+              </w:rPr>
+              <w:t>1</w:t>
+            </w:r>
+          </w:p>
+        </w:tc>
+        <w:tc>
+          <w:tcPr>
+            <w:tcW w:type="dxa" w:w="1247"/>
+            <w:vAlign w:val="center"/>
+          </w:tcPr>
+          <w:p>
+            <w:pPr>
+              <w:spacing w:before="40" w:after="40" w:line="276" w:lineRule="auto"/>
+              <w:jc w:val="center"/>
+            </w:pPr>
+            <w:r>
+              <w:rPr>
+                <w:rFonts w:ascii="Times New Roman" w:hAnsi="Times New Roman"/>
+                <w:sz w:val="26"/>
+                <w:rFonts w:ascii="Times New Roman" w:hAnsi="Times New Roman" w:cs="Times New Roman"/>
+              </w:rPr>
+              <w:t>4</w:t>
+            </w:r>
+          </w:p>
+        </w:tc>
+        <w:tc>
+          <w:tcPr>
+            <w:tcW w:type="dxa" w:w="3402"/>
+            <w:vAlign w:val="center"/>
+          </w:tcPr>
+          <w:p>
+            <w:pPr>
+              <w:spacing w:before="40" w:after="40" w:line="276" w:lineRule="auto"/>
+              <w:jc w:val="both"/>
+            </w:pPr>
+            <w:r>
+              <w:rPr>
+                <w:rFonts w:ascii="Times New Roman" w:hAnsi="Times New Roman"/>
+                <w:sz w:val="26"/>
+                <w:rFonts w:ascii="Times New Roman" w:hAnsi="Times New Roman" w:cs="Times New Roman"/>
+              </w:rPr>
+              <w:t>- Biết tệp chương trình cũng là dữ liệu lưu trữ trong máy tính.  - Nêu ví dụ biện pháp an toàn dữ liệu: sao lưu, phòng chống xâm nhập trái phép, virus,...</w:t>
+            </w:r>
+          </w:p>
+        </w:tc>
+      </w:tr>
+      <w:tr>
+        <w:tc>
+          <w:tcPr>
+            <w:tcW w:type="dxa" w:w="9310"/>
+            <w:gridSpan w:val="5"/>
+            <w:vAlign w:val="center"/>
+          </w:tcPr>
+          <w:p>
+            <w:pPr>
+              <w:spacing w:before="40" w:after="40" w:line="276" w:lineRule="auto"/>
+              <w:jc w:val="both"/>
+            </w:pPr>
+            <w:r>
+              <w:rPr>
+                <w:rFonts w:ascii="Times New Roman" w:hAnsi="Times New Roman"/>
+                <w:b/>
+                <w:sz w:val="26"/>
+                <w:rFonts w:ascii="Times New Roman" w:hAnsi="Times New Roman" w:cs="Times New Roman"/>
+              </w:rPr>
+              <w:t>Chủ đề 2: Tổ chức lưu trữ, tìm kiếm và trao đổi thông tin</w:t>
+            </w:r>
+          </w:p>
+        </w:tc>
+      </w:tr>
+      <w:tr>
+        <w:tc>
+          <w:tcPr>
+            <w:tcW w:type="dxa" w:w="680"/>
+            <w:vAlign w:val="center"/>
+          </w:tcPr>
+          <w:p>
+            <w:pPr>
+              <w:spacing w:before="40" w:after="40" w:line="276" w:lineRule="auto"/>
+              <w:jc w:val="center"/>
+            </w:pPr>
+            <w:r>
+              <w:rPr>
+                <w:rFonts w:ascii="Times New Roman" w:hAnsi="Times New Roman"/>
+                <w:sz w:val="26"/>
+                <w:rFonts w:ascii="Times New Roman" w:hAnsi="Times New Roman" w:cs="Times New Roman"/>
+              </w:rPr>
+              <w:t>5</w:t>
+            </w:r>
+          </w:p>
+        </w:tc>
+        <w:tc>
+          <w:tcPr>
+            <w:tcW w:type="dxa" w:w="3118"/>
+            <w:vAlign w:val="center"/>
+          </w:tcPr>
+          <w:p>
+            <w:pPr>
+              <w:spacing w:before="40" w:after="40" w:line="276" w:lineRule="auto"/>
+              <w:jc w:val="both"/>
+            </w:pPr>
+            <w:r>
+              <w:rPr>
+                <w:rFonts w:ascii="Times New Roman" w:hAnsi="Times New Roman"/>
+                <w:sz w:val="26"/>
+                <w:rFonts w:ascii="Times New Roman" w:hAnsi="Times New Roman" w:cs="Times New Roman"/>
+              </w:rPr>
+              <w:t>Bài 4. Mạng xã hội và một số kênh trao đổi thông tin trên Internet</w:t>
+            </w:r>
+          </w:p>
+        </w:tc>
+        <w:tc>
+          <w:tcPr>
+            <w:tcW w:type="dxa" w:w="850"/>
+            <w:vAlign w:val="center"/>
+          </w:tcPr>
+          <w:p>
+            <w:pPr>
+              <w:spacing w:before="40" w:after="40" w:line="276" w:lineRule="auto"/>
+              <w:jc w:val="center"/>
+            </w:pPr>
+            <w:r>
+              <w:rPr>
+                <w:rFonts w:ascii="Times New Roman" w:hAnsi="Times New Roman"/>
+                <w:sz w:val="26"/>
+                <w:rFonts w:ascii="Times New Roman" w:hAnsi="Times New Roman" w:cs="Times New Roman"/>
+              </w:rPr>
+              <w:t>1</w:t>
+            </w:r>
+          </w:p>
+        </w:tc>
+        <w:tc>
+          <w:tcPr>
+            <w:tcW w:type="dxa" w:w="1247"/>
+            <w:vAlign w:val="center"/>
+          </w:tcPr>
+          <w:p>
+            <w:pPr>
+              <w:spacing w:before="40" w:after="40" w:line="276" w:lineRule="auto"/>
+              <w:jc w:val="center"/>
+            </w:pPr>
+            <w:r>
+              <w:rPr>
+                <w:rFonts w:ascii="Times New Roman" w:hAnsi="Times New Roman"/>
+                <w:sz w:val="26"/>
+                <w:rFonts w:ascii="Times New Roman" w:hAnsi="Times New Roman" w:cs="Times New Roman"/>
+              </w:rPr>
+              <w:t>5</w:t>
+            </w:r>
+          </w:p>
+        </w:tc>
+        <w:tc>
+          <w:tcPr>
+            <w:tcW w:type="dxa" w:w="3402"/>
+            <w:vAlign w:val="center"/>
+          </w:tcPr>
+          <w:p>
+            <w:pPr>
+              <w:spacing w:before="40" w:after="40" w:line="276" w:lineRule="auto"/>
+              <w:jc w:val="both"/>
+            </w:pPr>
+            <w:r>
+              <w:rPr>
+                <w:rFonts w:ascii="Times New Roman" w:hAnsi="Times New Roman"/>
+                <w:sz w:val="26"/>
+                <w:rFonts w:ascii="Times New Roman" w:hAnsi="Times New Roman" w:cs="Times New Roman"/>
+              </w:rPr>
+              <w:t>- Nêu chức năng cơ bản của mạng xã hội; nhận biết các website mạng xã hội và sử dụng chức năng giao lưu, chia sẻ.  - Nêu tên kênh trao đổi thông tin thông dụng; nêu hậu quả việc dùng thông tin sai trái.</w:t>
+            </w:r>
+          </w:p>
+        </w:tc>
+      </w:tr>
+      <w:tr>
+        <w:tc>
+          <w:tcPr>
+            <w:tcW w:type="dxa" w:w="680"/>
+            <w:vAlign w:val="center"/>
+          </w:tcPr>
+          <w:p>
+            <w:pPr>
+              <w:spacing w:before="40" w:after="40" w:line="276" w:lineRule="auto"/>
+              <w:jc w:val="center"/>
+            </w:pPr>
+            <w:r>
+              <w:rPr>
+                <w:rFonts w:ascii="Times New Roman" w:hAnsi="Times New Roman"/>
+                <w:sz w:val="26"/>
+                <w:rFonts w:ascii="Times New Roman" w:hAnsi="Times New Roman" w:cs="Times New Roman"/>
+              </w:rPr>
+              <w:t>6</w:t>
+            </w:r>
+          </w:p>
+        </w:tc>
+        <w:tc>
+          <w:tcPr>
+            <w:tcW w:type="dxa" w:w="3118"/>
+            <w:vAlign w:val="center"/>
+          </w:tcPr>
+          <w:p>
+            <w:pPr>
+              <w:spacing w:before="40" w:after="40" w:line="276" w:lineRule="auto"/>
+              <w:jc w:val="both"/>
+            </w:pPr>
+            <w:r>
+              <w:rPr>
+                <w:rFonts w:ascii="Times New Roman" w:hAnsi="Times New Roman"/>
+                <w:sz w:val="26"/>
+                <w:rFonts w:ascii="Times New Roman" w:hAnsi="Times New Roman" w:cs="Times New Roman"/>
+              </w:rPr>
+              <w:t>Ôn tập Đánh giá định kỳ 1</w:t>
+            </w:r>
+          </w:p>
+        </w:tc>
+        <w:tc>
+          <w:tcPr>
+            <w:tcW w:type="dxa" w:w="850"/>
+            <w:vAlign w:val="center"/>
+          </w:tcPr>
+          <w:p>
+            <w:pPr>
+              <w:spacing w:before="40" w:after="40" w:line="276" w:lineRule="auto"/>
+              <w:jc w:val="center"/>
+            </w:pPr>
+            <w:r>
+              <w:rPr>
+                <w:rFonts w:ascii="Times New Roman" w:hAnsi="Times New Roman"/>
+                <w:sz w:val="26"/>
+                <w:rFonts w:ascii="Times New Roman" w:hAnsi="Times New Roman" w:cs="Times New Roman"/>
+              </w:rPr>
+              <w:t>1</w:t>
+            </w:r>
+          </w:p>
+        </w:tc>
+        <w:tc>
+          <w:tcPr>
+            <w:tcW w:type="dxa" w:w="1247"/>
+            <w:vAlign w:val="center"/>
+          </w:tcPr>
+          <w:p>
+            <w:pPr>
+              <w:spacing w:before="40" w:after="40" w:line="276" w:lineRule="auto"/>
+              <w:jc w:val="center"/>
+            </w:pPr>
+            <w:r>
+              <w:rPr>
+                <w:rFonts w:ascii="Times New Roman" w:hAnsi="Times New Roman"/>
+                <w:sz w:val="26"/>
+                <w:rFonts w:ascii="Times New Roman" w:hAnsi="Times New Roman" w:cs="Times New Roman"/>
+              </w:rPr>
+              <w:t>6</w:t>
+            </w:r>
+          </w:p>
+        </w:tc>
+        <w:tc>
+          <w:tcPr>
+            <w:tcW w:type="dxa" w:w="3402"/>
+            <w:vAlign w:val="center"/>
+          </w:tcPr>
+          <w:p>
+            <w:pPr>
+              <w:spacing w:before="40" w:after="40" w:line="276" w:lineRule="auto"/>
+              <w:jc w:val="both"/>
+            </w:pPr>
+            <w:r>
+              <w:rPr>
+                <w:rFonts w:ascii="Times New Roman" w:hAnsi="Times New Roman"/>
+                <w:sz w:val="26"/>
+                <w:rFonts w:ascii="Times New Roman" w:hAnsi="Times New Roman" w:cs="Times New Roman"/>
+              </w:rPr>
+              <w:t>Hệ thống hóa kiến thức chuẩn bị Đánh giá định kỳ 1.</w:t>
+            </w:r>
+          </w:p>
+        </w:tc>
+      </w:tr>
+      <w:tr>
+        <w:tc>
+          <w:tcPr>
+            <w:tcW w:type="dxa" w:w="680"/>
+            <w:vAlign w:val="center"/>
+          </w:tcPr>
+          <w:p>
+            <w:pPr>
+              <w:spacing w:before="40" w:after="40" w:line="276" w:lineRule="auto"/>
+              <w:jc w:val="center"/>
+            </w:pPr>
+            <w:r>
+              <w:rPr>
+                <w:rFonts w:ascii="Times New Roman" w:hAnsi="Times New Roman"/>
+                <w:sz w:val="26"/>
+                <w:rFonts w:ascii="Times New Roman" w:hAnsi="Times New Roman" w:cs="Times New Roman"/>
+              </w:rPr>
+              <w:t>7</w:t>
+            </w:r>
+          </w:p>
+        </w:tc>
+        <w:tc>
+          <w:tcPr>
+            <w:tcW w:type="dxa" w:w="3118"/>
+            <w:vAlign w:val="center"/>
+          </w:tcPr>
+          <w:p>
+            <w:pPr>
+              <w:spacing w:before="40" w:after="40" w:line="276" w:lineRule="auto"/>
+              <w:jc w:val="both"/>
+            </w:pPr>
+            <w:r>
+              <w:rPr>
+                <w:rFonts w:ascii="Times New Roman" w:hAnsi="Times New Roman"/>
+                <w:sz w:val="26"/>
+                <w:rFonts w:ascii="Times New Roman" w:hAnsi="Times New Roman" w:cs="Times New Roman"/>
+              </w:rPr>
+              <w:t>Đánh giá định kỳ 1</w:t>
+            </w:r>
+          </w:p>
+        </w:tc>
+        <w:tc>
+          <w:tcPr>
+            <w:tcW w:type="dxa" w:w="850"/>
+            <w:vAlign w:val="center"/>
+          </w:tcPr>
+          <w:p>
+            <w:pPr>
+              <w:spacing w:before="40" w:after="40" w:line="276" w:lineRule="auto"/>
+              <w:jc w:val="center"/>
+            </w:pPr>
+            <w:r>
+              <w:rPr>
+                <w:rFonts w:ascii="Times New Roman" w:hAnsi="Times New Roman"/>
+                <w:sz w:val="26"/>
+                <w:rFonts w:ascii="Times New Roman" w:hAnsi="Times New Roman" w:cs="Times New Roman"/>
+              </w:rPr>
+              <w:t>1</w:t>
+            </w:r>
+          </w:p>
+        </w:tc>
+        <w:tc>
+          <w:tcPr>
+            <w:tcW w:type="dxa" w:w="1247"/>
+            <w:vAlign w:val="center"/>
+          </w:tcPr>
+          <w:p>
+            <w:pPr>
+              <w:spacing w:before="40" w:after="40" w:line="276" w:lineRule="auto"/>
+              <w:jc w:val="center"/>
+            </w:pPr>
+            <w:r>
+              <w:rPr>
+                <w:rFonts w:ascii="Times New Roman" w:hAnsi="Times New Roman"/>
+                <w:sz w:val="26"/>
+                <w:rFonts w:ascii="Times New Roman" w:hAnsi="Times New Roman" w:cs="Times New Roman"/>
+              </w:rPr>
+              <w:t>7</w:t>
+            </w:r>
+          </w:p>
+        </w:tc>
+        <w:tc>
+          <w:tcPr>
+            <w:tcW w:type="dxa" w:w="3402"/>
+            <w:vAlign w:val="center"/>
+          </w:tcPr>
+          <w:p>
+            <w:pPr>
+              <w:spacing w:before="40" w:after="40" w:line="276" w:lineRule="auto"/>
+              <w:jc w:val="both"/>
+            </w:pPr>
+            <w:r>
+              <w:rPr>
+                <w:rFonts w:ascii="Times New Roman" w:hAnsi="Times New Roman"/>
+                <w:sz w:val="26"/>
+                <w:rFonts w:ascii="Times New Roman" w:hAnsi="Times New Roman" w:cs="Times New Roman"/>
+              </w:rPr>
+              <w:t>Kiểm tra đánh giá kết quả học tập.</w:t>
+            </w:r>
+          </w:p>
+        </w:tc>
+      </w:tr>
+      <w:tr>
+        <w:tc>
+          <w:tcPr>
+            <w:tcW w:type="dxa" w:w="9310"/>
+            <w:gridSpan w:val="5"/>
+            <w:vAlign w:val="center"/>
+          </w:tcPr>
+          <w:p>
+            <w:pPr>
+              <w:spacing w:before="40" w:after="40" w:line="276" w:lineRule="auto"/>
+              <w:jc w:val="both"/>
+            </w:pPr>
+            <w:r>
+              <w:rPr>
+                <w:rFonts w:ascii="Times New Roman" w:hAnsi="Times New Roman"/>
+                <w:b/>
+                <w:sz w:val="26"/>
+                <w:rFonts w:ascii="Times New Roman" w:hAnsi="Times New Roman" w:cs="Times New Roman"/>
+              </w:rPr>
+              <w:t>Chủ đề 3: Đạo đức, pháp luật và văn hóa trong môi trường số</w:t>
+            </w:r>
+          </w:p>
+        </w:tc>
+      </w:tr>
+      <w:tr>
+        <w:tc>
+          <w:tcPr>
+            <w:tcW w:type="dxa" w:w="680"/>
+            <w:vAlign w:val="center"/>
+          </w:tcPr>
+          <w:p>
+            <w:pPr>
+              <w:spacing w:before="40" w:after="40" w:line="276" w:lineRule="auto"/>
+              <w:jc w:val="center"/>
+            </w:pPr>
+            <w:r>
+              <w:rPr>
+                <w:rFonts w:ascii="Times New Roman" w:hAnsi="Times New Roman"/>
+                <w:sz w:val="26"/>
+                <w:rFonts w:ascii="Times New Roman" w:hAnsi="Times New Roman" w:cs="Times New Roman"/>
+              </w:rPr>
+              <w:t>8</w:t>
+            </w:r>
+          </w:p>
+        </w:tc>
+        <w:tc>
+          <w:tcPr>
+            <w:tcW w:type="dxa" w:w="3118"/>
+            <w:vAlign w:val="center"/>
+          </w:tcPr>
+          <w:p>
+            <w:pPr>
+              <w:spacing w:before="40" w:after="40" w:line="276" w:lineRule="auto"/>
+              <w:jc w:val="both"/>
+            </w:pPr>
+            <w:r>
+              <w:rPr>
+                <w:rFonts w:ascii="Times New Roman" w:hAnsi="Times New Roman"/>
+                <w:sz w:val="26"/>
+                <w:rFonts w:ascii="Times New Roman" w:hAnsi="Times New Roman" w:cs="Times New Roman"/>
+              </w:rPr>
+              <w:t>Bài 5. Ứng xử trên mạng</w:t>
+            </w:r>
+          </w:p>
+        </w:tc>
+        <w:tc>
+          <w:tcPr>
+            <w:tcW w:type="dxa" w:w="850"/>
+            <w:vAlign w:val="center"/>
+          </w:tcPr>
+          <w:p>
+            <w:pPr>
+              <w:spacing w:before="40" w:after="40" w:line="276" w:lineRule="auto"/>
+              <w:jc w:val="center"/>
+            </w:pPr>
+            <w:r>
+              <w:rPr>
+                <w:rFonts w:ascii="Times New Roman" w:hAnsi="Times New Roman"/>
+                <w:sz w:val="26"/>
+                <w:rFonts w:ascii="Times New Roman" w:hAnsi="Times New Roman" w:cs="Times New Roman"/>
+              </w:rPr>
+              <w:t>1</w:t>
+            </w:r>
+          </w:p>
+        </w:tc>
+        <w:tc>
+          <w:tcPr>
+            <w:tcW w:type="dxa" w:w="1247"/>
+            <w:vAlign w:val="center"/>
+          </w:tcPr>
+          <w:p>
+            <w:pPr>
+              <w:spacing w:before="40" w:after="40" w:line="276" w:lineRule="auto"/>
+              <w:jc w:val="center"/>
+            </w:pPr>
+            <w:r>
+              <w:rPr>
+                <w:rFonts w:ascii="Times New Roman" w:hAnsi="Times New Roman"/>
+                <w:sz w:val="26"/>
+                <w:rFonts w:ascii="Times New Roman" w:hAnsi="Times New Roman" w:cs="Times New Roman"/>
+              </w:rPr>
+              <w:t>8</w:t>
+            </w:r>
+          </w:p>
+        </w:tc>
+        <w:tc>
+          <w:tcPr>
+            <w:tcW w:type="dxa" w:w="3402"/>
+            <w:vAlign w:val="center"/>
+          </w:tcPr>
+          <w:p>
+            <w:pPr>
+              <w:spacing w:before="40" w:after="40" w:line="276" w:lineRule="auto"/>
+              <w:jc w:val="both"/>
+            </w:pPr>
+            <w:r>
+              <w:rPr>
+                <w:rFonts w:ascii="Times New Roman" w:hAnsi="Times New Roman"/>
+                <w:sz w:val="26"/>
+                <w:rFonts w:ascii="Times New Roman" w:hAnsi="Times New Roman" w:cs="Times New Roman"/>
+              </w:rPr>
+              <w:t>- Giao tiếp qua mạng đúng quy tắc, lịch sự, có văn hóa.  - Biết tác hại của bệnh nghiện Internet để phòng tránh; biết nhờ người lớn giúp đỡ khi cần.</w:t>
+            </w:r>
+          </w:p>
+        </w:tc>
+      </w:tr>
+      <w:tr>
+        <w:tc>
+          <w:tcPr>
+            <w:tcW w:type="dxa" w:w="9310"/>
+            <w:gridSpan w:val="5"/>
+            <w:vAlign w:val="center"/>
+          </w:tcPr>
+          <w:p>
+            <w:pPr>
+              <w:spacing w:before="40" w:after="40" w:line="276" w:lineRule="auto"/>
+              <w:jc w:val="both"/>
+            </w:pPr>
+            <w:r>
+              <w:rPr>
+                <w:rFonts w:ascii="Times New Roman" w:hAnsi="Times New Roman"/>
+                <w:b/>
+                <w:sz w:val="26"/>
+                <w:rFonts w:ascii="Times New Roman" w:hAnsi="Times New Roman" w:cs="Times New Roman"/>
+              </w:rPr>
+              <w:t>Chủ đề 4: Ứng dụng tin học</w:t>
+            </w:r>
+          </w:p>
+        </w:tc>
+      </w:tr>
+      <w:tr>
+        <w:tc>
+          <w:tcPr>
+            <w:tcW w:type="dxa" w:w="680"/>
+            <w:vAlign w:val="center"/>
+          </w:tcPr>
+          <w:p>
+            <w:pPr>
+              <w:spacing w:before="40" w:after="40" w:line="276" w:lineRule="auto"/>
+              <w:jc w:val="center"/>
+            </w:pPr>
+            <w:r>
+              <w:rPr>
+                <w:rFonts w:ascii="Times New Roman" w:hAnsi="Times New Roman"/>
+                <w:sz w:val="26"/>
+                <w:rFonts w:ascii="Times New Roman" w:hAnsi="Times New Roman" w:cs="Times New Roman"/>
+              </w:rPr>
+              <w:t>9</w:t>
+            </w:r>
+          </w:p>
+        </w:tc>
+        <w:tc>
+          <w:tcPr>
+            <w:tcW w:type="dxa" w:w="3118"/>
+            <w:vAlign w:val="center"/>
+          </w:tcPr>
+          <w:p>
+            <w:pPr>
+              <w:spacing w:before="40" w:after="40" w:line="276" w:lineRule="auto"/>
+              <w:jc w:val="both"/>
+            </w:pPr>
+            <w:r>
+              <w:rPr>
+                <w:rFonts w:ascii="Times New Roman" w:hAnsi="Times New Roman"/>
+                <w:sz w:val="26"/>
+                <w:rFonts w:ascii="Times New Roman" w:hAnsi="Times New Roman" w:cs="Times New Roman"/>
+              </w:rPr>
+              <w:t>Bài 6. Làm quen với phần mềm bảng tính</w:t>
+            </w:r>
+          </w:p>
+        </w:tc>
+        <w:tc>
+          <w:tcPr>
+            <w:tcW w:type="dxa" w:w="850"/>
+            <w:vAlign w:val="center"/>
+          </w:tcPr>
+          <w:p>
+            <w:pPr>
+              <w:spacing w:before="40" w:after="40" w:line="276" w:lineRule="auto"/>
+              <w:jc w:val="center"/>
+            </w:pPr>
+            <w:r>
+              <w:rPr>
+                <w:rFonts w:ascii="Times New Roman" w:hAnsi="Times New Roman"/>
+                <w:sz w:val="26"/>
+                <w:rFonts w:ascii="Times New Roman" w:hAnsi="Times New Roman" w:cs="Times New Roman"/>
+              </w:rPr>
+              <w:t>1</w:t>
+            </w:r>
+          </w:p>
+        </w:tc>
+        <w:tc>
+          <w:tcPr>
+            <w:tcW w:type="dxa" w:w="1247"/>
+            <w:vAlign w:val="center"/>
+          </w:tcPr>
+          <w:p>
+            <w:pPr>
+              <w:spacing w:before="40" w:after="40" w:line="276" w:lineRule="auto"/>
+              <w:jc w:val="center"/>
+            </w:pPr>
+            <w:r>
+              <w:rPr>
+                <w:rFonts w:ascii="Times New Roman" w:hAnsi="Times New Roman"/>
+                <w:sz w:val="26"/>
+                <w:rFonts w:ascii="Times New Roman" w:hAnsi="Times New Roman" w:cs="Times New Roman"/>
+              </w:rPr>
+              <w:t>9</w:t>
+            </w:r>
+          </w:p>
+        </w:tc>
+        <w:tc>
+          <w:tcPr>
+            <w:tcW w:type="dxa" w:w="3402"/>
+            <w:vAlign w:val="center"/>
+          </w:tcPr>
+          <w:p>
+            <w:pPr>
+              <w:spacing w:before="40" w:after="40" w:line="276" w:lineRule="auto"/>
+              <w:jc w:val="both"/>
+            </w:pPr>
+            <w:r>
+              <w:rPr>
+                <w:rFonts w:ascii="Times New Roman" w:hAnsi="Times New Roman"/>
+                <w:sz w:val="26"/>
+                <w:rFonts w:ascii="Times New Roman" w:hAnsi="Times New Roman" w:cs="Times New Roman"/>
+              </w:rPr>
+              <w:t>- Nhận biết khái niệm/chức năng cơ bản của phần mềm bảng tính.  - Nhập, điều chỉnh dữ liệu đơn giản; thay đổi phông chữ, màu nền, căn chỉnh ô tính, độ rộng cột.</w:t>
+            </w:r>
+          </w:p>
+        </w:tc>
+      </w:tr>
+      <w:tr>
+        <w:tc>
+          <w:tcPr>
+            <w:tcW w:type="dxa" w:w="680"/>
+            <w:vAlign w:val="center"/>
+          </w:tcPr>
+          <w:p>
+            <w:pPr>
+              <w:spacing w:before="40" w:after="40" w:line="276" w:lineRule="auto"/>
+              <w:jc w:val="center"/>
+            </w:pPr>
+            <w:r>
+              <w:rPr>
+                <w:rFonts w:ascii="Times New Roman" w:hAnsi="Times New Roman"/>
+                <w:sz w:val="26"/>
+                <w:rFonts w:ascii="Times New Roman" w:hAnsi="Times New Roman" w:cs="Times New Roman"/>
+              </w:rPr>
+              <w:t>10</w:t>
+            </w:r>
+          </w:p>
+        </w:tc>
+        <w:tc>
+          <w:tcPr>
+            <w:tcW w:type="dxa" w:w="3118"/>
+            <w:vAlign w:val="center"/>
+          </w:tcPr>
+          <w:p>
+            <w:pPr>
+              <w:spacing w:before="40" w:after="40" w:line="276" w:lineRule="auto"/>
+              <w:jc w:val="both"/>
+            </w:pPr>
+            <w:r>
+              <w:rPr>
+                <w:rFonts w:ascii="Times New Roman" w:hAnsi="Times New Roman"/>
+                <w:sz w:val="26"/>
+                <w:rFonts w:ascii="Times New Roman" w:hAnsi="Times New Roman" w:cs="Times New Roman"/>
+              </w:rPr>
+              <w:t>Bài 7. Tính toán tự động trên bảng tính</w:t>
+            </w:r>
+          </w:p>
+        </w:tc>
+        <w:tc>
+          <w:tcPr>
+            <w:tcW w:type="dxa" w:w="850"/>
+            <w:vAlign w:val="center"/>
+          </w:tcPr>
+          <w:p>
+            <w:pPr>
+              <w:spacing w:before="40" w:after="40" w:line="276" w:lineRule="auto"/>
+              <w:jc w:val="center"/>
+            </w:pPr>
+            <w:r>
+              <w:rPr>
+                <w:rFonts w:ascii="Times New Roman" w:hAnsi="Times New Roman"/>
+                <w:sz w:val="26"/>
+                <w:rFonts w:ascii="Times New Roman" w:hAnsi="Times New Roman" w:cs="Times New Roman"/>
+              </w:rPr>
+              <w:t>1</w:t>
+            </w:r>
+          </w:p>
+        </w:tc>
+        <w:tc>
+          <w:tcPr>
+            <w:tcW w:type="dxa" w:w="1247"/>
+            <w:vAlign w:val="center"/>
+          </w:tcPr>
+          <w:p>
+            <w:pPr>
+              <w:spacing w:before="40" w:after="40" w:line="276" w:lineRule="auto"/>
+              <w:jc w:val="center"/>
+            </w:pPr>
+            <w:r>
+              <w:rPr>
+                <w:rFonts w:ascii="Times New Roman" w:hAnsi="Times New Roman"/>
+                <w:sz w:val="26"/>
+                <w:rFonts w:ascii="Times New Roman" w:hAnsi="Times New Roman" w:cs="Times New Roman"/>
+              </w:rPr>
+              <w:t>10</w:t>
+            </w:r>
+          </w:p>
+        </w:tc>
+        <w:tc>
+          <w:tcPr>
+            <w:tcW w:type="dxa" w:w="3402"/>
+            <w:vAlign w:val="center"/>
+          </w:tcPr>
+          <w:p>
+            <w:pPr>
+              <w:spacing w:before="40" w:after="40" w:line="276" w:lineRule="auto"/>
+              <w:jc w:val="both"/>
+            </w:pPr>
+            <w:r>
+              <w:rPr>
+                <w:rFonts w:ascii="Times New Roman" w:hAnsi="Times New Roman"/>
+                <w:sz w:val="26"/>
+                <w:rFonts w:ascii="Times New Roman" w:hAnsi="Times New Roman" w:cs="Times New Roman"/>
+              </w:rPr>
+              <w:t>- Nhận biết kiểu dữ liệu; biết nhập và sao chép công thức trên bảng tính.  - Giải thích việc đưa công thức vào bảng tính là cách điều khiển tính toán tự động.</w:t>
+            </w:r>
+          </w:p>
+        </w:tc>
+      </w:tr>
+      <w:tr>
+        <w:tc>
+          <w:tcPr>
+            <w:tcW w:type="dxa" w:w="680"/>
+            <w:vAlign w:val="center"/>
+          </w:tcPr>
+          <w:p>
+            <w:pPr>
+              <w:spacing w:before="40" w:after="40" w:line="276" w:lineRule="auto"/>
+              <w:jc w:val="center"/>
+            </w:pPr>
+            <w:r>
+              <w:rPr>
+                <w:rFonts w:ascii="Times New Roman" w:hAnsi="Times New Roman"/>
+                <w:sz w:val="26"/>
+                <w:rFonts w:ascii="Times New Roman" w:hAnsi="Times New Roman" w:cs="Times New Roman"/>
+              </w:rPr>
+              <w:t>11</w:t>
+            </w:r>
+          </w:p>
+        </w:tc>
+        <w:tc>
+          <w:tcPr>
+            <w:tcW w:type="dxa" w:w="3118"/>
+            <w:vAlign w:val="center"/>
+          </w:tcPr>
+          <w:p>
+            <w:pPr>
+              <w:spacing w:before="40" w:after="40" w:line="276" w:lineRule="auto"/>
+              <w:jc w:val="both"/>
+            </w:pPr>
+            <w:r>
+              <w:rPr>
+                <w:rFonts w:ascii="Times New Roman" w:hAnsi="Times New Roman"/>
+                <w:sz w:val="26"/>
+                <w:rFonts w:ascii="Times New Roman" w:hAnsi="Times New Roman" w:cs="Times New Roman"/>
+              </w:rPr>
+              <w:t>Bài 8. Công cụ hỗ trợ tính toán</w:t>
+            </w:r>
+          </w:p>
+        </w:tc>
+        <w:tc>
+          <w:tcPr>
+            <w:tcW w:type="dxa" w:w="850"/>
+            <w:vAlign w:val="center"/>
+          </w:tcPr>
+          <w:p>
+            <w:pPr>
+              <w:spacing w:before="40" w:after="40" w:line="276" w:lineRule="auto"/>
+              <w:jc w:val="center"/>
+            </w:pPr>
+            <w:r>
+              <w:rPr>
+                <w:rFonts w:ascii="Times New Roman" w:hAnsi="Times New Roman"/>
+                <w:sz w:val="26"/>
+                <w:rFonts w:ascii="Times New Roman" w:hAnsi="Times New Roman" w:cs="Times New Roman"/>
+              </w:rPr>
+              <w:t>1</w:t>
+            </w:r>
+          </w:p>
+        </w:tc>
+        <w:tc>
+          <w:tcPr>
+            <w:tcW w:type="dxa" w:w="1247"/>
+            <w:vAlign w:val="center"/>
+          </w:tcPr>
+          <w:p>
+            <w:pPr>
+              <w:spacing w:before="40" w:after="40" w:line="276" w:lineRule="auto"/>
+              <w:jc w:val="center"/>
+            </w:pPr>
+            <w:r>
+              <w:rPr>
+                <w:rFonts w:ascii="Times New Roman" w:hAnsi="Times New Roman"/>
+                <w:sz w:val="26"/>
+                <w:rFonts w:ascii="Times New Roman" w:hAnsi="Times New Roman" w:cs="Times New Roman"/>
+              </w:rPr>
+              <w:t>11</w:t>
+            </w:r>
+          </w:p>
+        </w:tc>
+        <w:tc>
+          <w:tcPr>
+            <w:tcW w:type="dxa" w:w="3402"/>
+            <w:vAlign w:val="center"/>
+          </w:tcPr>
+          <w:p>
+            <w:pPr>
+              <w:spacing w:before="40" w:after="40" w:line="276" w:lineRule="auto"/>
+              <w:jc w:val="both"/>
+            </w:pPr>
+            <w:r>
+              <w:rPr>
+                <w:rFonts w:ascii="Times New Roman" w:hAnsi="Times New Roman"/>
+                <w:sz w:val="26"/>
+                <w:rFonts w:ascii="Times New Roman" w:hAnsi="Times New Roman" w:cs="Times New Roman"/>
+              </w:rPr>
+              <w:t>- Thực hiện phép toán thông dụng; sử dụng hàm đơn giản: MAX, MIN, AVERAGE, COUNT,...</w:t>
+            </w:r>
+          </w:p>
+        </w:tc>
+      </w:tr>
+      <w:tr>
+        <w:tc>
+          <w:tcPr>
+            <w:tcW w:type="dxa" w:w="680"/>
+            <w:vAlign w:val="center"/>
+          </w:tcPr>
+          <w:p>
+            <w:pPr>
+              <w:spacing w:before="40" w:after="40" w:line="276" w:lineRule="auto"/>
+              <w:jc w:val="center"/>
+            </w:pPr>
+            <w:r>
+              <w:rPr>
+                <w:rFonts w:ascii="Times New Roman" w:hAnsi="Times New Roman"/>
+                <w:sz w:val="26"/>
+                <w:rFonts w:ascii="Times New Roman" w:hAnsi="Times New Roman" w:cs="Times New Roman"/>
+              </w:rPr>
+              <w:t>12</w:t>
+            </w:r>
+          </w:p>
+        </w:tc>
+        <w:tc>
+          <w:tcPr>
+            <w:tcW w:type="dxa" w:w="3118"/>
+            <w:vAlign w:val="center"/>
+          </w:tcPr>
+          <w:p>
+            <w:pPr>
+              <w:spacing w:before="40" w:after="40" w:line="276" w:lineRule="auto"/>
+              <w:jc w:val="both"/>
+            </w:pPr>
+            <w:r>
+              <w:rPr>
+                <w:rFonts w:ascii="Times New Roman" w:hAnsi="Times New Roman"/>
+                <w:sz w:val="26"/>
+                <w:rFonts w:ascii="Times New Roman" w:hAnsi="Times New Roman" w:cs="Times New Roman"/>
+              </w:rPr>
+              <w:t>Ôn tập Đánh giá định kỳ 2</w:t>
+            </w:r>
+          </w:p>
+        </w:tc>
+        <w:tc>
+          <w:tcPr>
+            <w:tcW w:type="dxa" w:w="850"/>
+            <w:vAlign w:val="center"/>
+          </w:tcPr>
+          <w:p>
+            <w:pPr>
+              <w:spacing w:before="40" w:after="40" w:line="276" w:lineRule="auto"/>
+              <w:jc w:val="center"/>
+            </w:pPr>
+            <w:r>
+              <w:rPr>
+                <w:rFonts w:ascii="Times New Roman" w:hAnsi="Times New Roman"/>
+                <w:sz w:val="26"/>
+                <w:rFonts w:ascii="Times New Roman" w:hAnsi="Times New Roman" w:cs="Times New Roman"/>
+              </w:rPr>
+              <w:t>1</w:t>
+            </w:r>
+          </w:p>
+        </w:tc>
+        <w:tc>
+          <w:tcPr>
+            <w:tcW w:type="dxa" w:w="1247"/>
+            <w:vAlign w:val="center"/>
+          </w:tcPr>
+          <w:p>
+            <w:pPr>
+              <w:spacing w:before="40" w:after="40" w:line="276" w:lineRule="auto"/>
+              <w:jc w:val="center"/>
+            </w:pPr>
+            <w:r>
+              <w:rPr>
+                <w:rFonts w:ascii="Times New Roman" w:hAnsi="Times New Roman"/>
+                <w:sz w:val="26"/>
+                <w:rFonts w:ascii="Times New Roman" w:hAnsi="Times New Roman" w:cs="Times New Roman"/>
+              </w:rPr>
+              <w:t>12</w:t>
+            </w:r>
+          </w:p>
+        </w:tc>
+        <w:tc>
+          <w:tcPr>
+            <w:tcW w:type="dxa" w:w="3402"/>
+            <w:vAlign w:val="center"/>
+          </w:tcPr>
+          <w:p>
+            <w:pPr>
+              <w:spacing w:before="40" w:after="40" w:line="276" w:lineRule="auto"/>
+              <w:jc w:val="both"/>
+            </w:pPr>
+            <w:r>
+              <w:rPr>
+                <w:rFonts w:ascii="Times New Roman" w:hAnsi="Times New Roman"/>
+                <w:sz w:val="26"/>
+                <w:rFonts w:ascii="Times New Roman" w:hAnsi="Times New Roman" w:cs="Times New Roman"/>
+              </w:rPr>
+              <w:t>Hệ thống hóa kiến thức chuẩn bị Đánh giá định kỳ 2.</w:t>
+            </w:r>
+          </w:p>
+        </w:tc>
+      </w:tr>
+      <w:tr>
+        <w:tc>
+          <w:tcPr>
+            <w:tcW w:type="dxa" w:w="680"/>
+            <w:vAlign w:val="center"/>
+          </w:tcPr>
+          <w:p>
+            <w:pPr>
+              <w:spacing w:before="40" w:after="40" w:line="276" w:lineRule="auto"/>
+              <w:jc w:val="center"/>
+            </w:pPr>
+            <w:r>
+              <w:rPr>
+                <w:rFonts w:ascii="Times New Roman" w:hAnsi="Times New Roman"/>
+                <w:sz w:val="26"/>
+                <w:rFonts w:ascii="Times New Roman" w:hAnsi="Times New Roman" w:cs="Times New Roman"/>
+              </w:rPr>
+              <w:t>13</w:t>
+            </w:r>
+          </w:p>
+        </w:tc>
+        <w:tc>
+          <w:tcPr>
+            <w:tcW w:type="dxa" w:w="3118"/>
+            <w:vAlign w:val="center"/>
+          </w:tcPr>
+          <w:p>
+            <w:pPr>
+              <w:spacing w:before="40" w:after="40" w:line="276" w:lineRule="auto"/>
+              <w:jc w:val="both"/>
+            </w:pPr>
+            <w:r>
+              <w:rPr>
+                <w:rFonts w:ascii="Times New Roman" w:hAnsi="Times New Roman"/>
+                <w:sz w:val="26"/>
+                <w:rFonts w:ascii="Times New Roman" w:hAnsi="Times New Roman" w:cs="Times New Roman"/>
+              </w:rPr>
+              <w:t>Đánh giá định kỳ 2</w:t>
+            </w:r>
+          </w:p>
+        </w:tc>
+        <w:tc>
+          <w:tcPr>
+            <w:tcW w:type="dxa" w:w="850"/>
+            <w:vAlign w:val="center"/>
+          </w:tcPr>
+          <w:p>
+            <w:pPr>
+              <w:spacing w:before="40" w:after="40" w:line="276" w:lineRule="auto"/>
+              <w:jc w:val="center"/>
+            </w:pPr>
+            <w:r>
+              <w:rPr>
+                <w:rFonts w:ascii="Times New Roman" w:hAnsi="Times New Roman"/>
+                <w:sz w:val="26"/>
+                <w:rFonts w:ascii="Times New Roman" w:hAnsi="Times New Roman" w:cs="Times New Roman"/>
+              </w:rPr>
+              <w:t>1</w:t>
+            </w:r>
+          </w:p>
+        </w:tc>
+        <w:tc>
+          <w:tcPr>
+            <w:tcW w:type="dxa" w:w="1247"/>
+            <w:vAlign w:val="center"/>
+          </w:tcPr>
+          <w:p>
+            <w:pPr>
+              <w:spacing w:before="40" w:after="40" w:line="276" w:lineRule="auto"/>
+              <w:jc w:val="center"/>
+            </w:pPr>
+            <w:r>
+              <w:rPr>
+                <w:rFonts w:ascii="Times New Roman" w:hAnsi="Times New Roman"/>
+                <w:sz w:val="26"/>
+                <w:rFonts w:ascii="Times New Roman" w:hAnsi="Times New Roman" w:cs="Times New Roman"/>
+              </w:rPr>
+              <w:t>13</w:t>
+            </w:r>
+          </w:p>
+        </w:tc>
+        <w:tc>
+          <w:tcPr>
+            <w:tcW w:type="dxa" w:w="3402"/>
+            <w:vAlign w:val="center"/>
+          </w:tcPr>
+          <w:p>
+            <w:pPr>
+              <w:spacing w:before="40" w:after="40" w:line="276" w:lineRule="auto"/>
+              <w:jc w:val="both"/>
+            </w:pPr>
+            <w:r>
+              <w:rPr>
+                <w:rFonts w:ascii="Times New Roman" w:hAnsi="Times New Roman"/>
+                <w:sz w:val="26"/>
+                <w:rFonts w:ascii="Times New Roman" w:hAnsi="Times New Roman" w:cs="Times New Roman"/>
+              </w:rPr>
+              <w:t>Kiểm tra đánh giá kết quả học tập.</w:t>
+            </w:r>
+          </w:p>
+        </w:tc>
+      </w:tr>
+      <w:tr>
+        <w:tc>
+          <w:tcPr>
+            <w:tcW w:type="dxa" w:w="680"/>
+            <w:vAlign w:val="center"/>
+          </w:tcPr>
+          <w:p>
+            <w:pPr>
+              <w:spacing w:before="40" w:after="40" w:line="276" w:lineRule="auto"/>
+              <w:jc w:val="center"/>
+            </w:pPr>
+            <w:r>
+              <w:rPr>
+                <w:rFonts w:ascii="Times New Roman" w:hAnsi="Times New Roman"/>
+                <w:sz w:val="26"/>
+                <w:rFonts w:ascii="Times New Roman" w:hAnsi="Times New Roman" w:cs="Times New Roman"/>
+              </w:rPr>
+              <w:t>14</w:t>
+            </w:r>
+          </w:p>
+        </w:tc>
+        <w:tc>
+          <w:tcPr>
+            <w:tcW w:type="dxa" w:w="3118"/>
+            <w:vAlign w:val="center"/>
+          </w:tcPr>
+          <w:p>
+            <w:pPr>
+              <w:spacing w:before="40" w:after="40" w:line="276" w:lineRule="auto"/>
+              <w:jc w:val="both"/>
+            </w:pPr>
+            <w:r>
+              <w:rPr>
+                <w:rFonts w:ascii="Times New Roman" w:hAnsi="Times New Roman"/>
+                <w:sz w:val="26"/>
+                <w:rFonts w:ascii="Times New Roman" w:hAnsi="Times New Roman" w:cs="Times New Roman"/>
+              </w:rPr>
+              <w:t>Bài 9. Trình bày bảng tính</w:t>
+            </w:r>
+          </w:p>
+        </w:tc>
+        <w:tc>
+          <w:tcPr>
+            <w:tcW w:type="dxa" w:w="850"/>
+            <w:vAlign w:val="center"/>
+          </w:tcPr>
+          <w:p>
+            <w:pPr>
+              <w:spacing w:before="40" w:after="40" w:line="276" w:lineRule="auto"/>
+              <w:jc w:val="center"/>
+            </w:pPr>
+            <w:r>
+              <w:rPr>
+                <w:rFonts w:ascii="Times New Roman" w:hAnsi="Times New Roman"/>
+                <w:sz w:val="26"/>
+                <w:rFonts w:ascii="Times New Roman" w:hAnsi="Times New Roman" w:cs="Times New Roman"/>
+              </w:rPr>
+              <w:t>1</w:t>
+            </w:r>
+          </w:p>
+        </w:tc>
+        <w:tc>
+          <w:tcPr>
+            <w:tcW w:type="dxa" w:w="1247"/>
+            <w:vAlign w:val="center"/>
+          </w:tcPr>
+          <w:p>
+            <w:pPr>
+              <w:spacing w:before="40" w:after="40" w:line="276" w:lineRule="auto"/>
+              <w:jc w:val="center"/>
+            </w:pPr>
+            <w:r>
+              <w:rPr>
+                <w:rFonts w:ascii="Times New Roman" w:hAnsi="Times New Roman"/>
+                <w:sz w:val="26"/>
+                <w:rFonts w:ascii="Times New Roman" w:hAnsi="Times New Roman" w:cs="Times New Roman"/>
+              </w:rPr>
+              <w:t>14</w:t>
+            </w:r>
+          </w:p>
+        </w:tc>
+        <w:tc>
+          <w:tcPr>
+            <w:tcW w:type="dxa" w:w="3402"/>
+            <w:vAlign w:val="center"/>
+          </w:tcPr>
+          <w:p>
+            <w:pPr>
+              <w:spacing w:before="40" w:after="40" w:line="276" w:lineRule="auto"/>
+              <w:jc w:val="both"/>
+            </w:pPr>
+            <w:r>
+              <w:rPr>
+                <w:rFonts w:ascii="Times New Roman" w:hAnsi="Times New Roman"/>
+                <w:sz w:val="26"/>
+                <w:rFonts w:ascii="Times New Roman" w:hAnsi="Times New Roman" w:cs="Times New Roman"/>
+              </w:rPr>
+              <w:t>- Định dạng dữ liệu số và trình bày bảng tính.  - Áp dụng các hàm (MAX, MIN, SUM, AVERAGE, COUNT) vào dự án Trường học xanh.</w:t>
+            </w:r>
+          </w:p>
+        </w:tc>
+      </w:tr>
+      <w:tr>
+        <w:tc>
+          <w:tcPr>
+            <w:tcW w:type="dxa" w:w="680"/>
+            <w:vAlign w:val="center"/>
+          </w:tcPr>
+          <w:p>
+            <w:pPr>
+              <w:spacing w:before="40" w:after="40" w:line="276" w:lineRule="auto"/>
+              <w:jc w:val="center"/>
+            </w:pPr>
+            <w:r>
+              <w:rPr>
+                <w:rFonts w:ascii="Times New Roman" w:hAnsi="Times New Roman"/>
+                <w:sz w:val="26"/>
+                <w:rFonts w:ascii="Times New Roman" w:hAnsi="Times New Roman" w:cs="Times New Roman"/>
+              </w:rPr>
+              <w:t>15</w:t>
+            </w:r>
+          </w:p>
+        </w:tc>
+        <w:tc>
+          <w:tcPr>
+            <w:tcW w:type="dxa" w:w="3118"/>
+            <w:vAlign w:val="center"/>
+          </w:tcPr>
+          <w:p>
+            <w:pPr>
+              <w:spacing w:before="40" w:after="40" w:line="276" w:lineRule="auto"/>
+              <w:jc w:val="both"/>
+            </w:pPr>
+            <w:r>
+              <w:rPr>
+                <w:rFonts w:ascii="Times New Roman" w:hAnsi="Times New Roman"/>
+                <w:sz w:val="26"/>
+                <w:rFonts w:ascii="Times New Roman" w:hAnsi="Times New Roman" w:cs="Times New Roman"/>
+              </w:rPr>
+              <w:t>Bài 10. Hoàn thiện bảng tính</w:t>
+            </w:r>
+          </w:p>
+        </w:tc>
+        <w:tc>
+          <w:tcPr>
+            <w:tcW w:type="dxa" w:w="850"/>
+            <w:vAlign w:val="center"/>
+          </w:tcPr>
+          <w:p>
+            <w:pPr>
+              <w:spacing w:before="40" w:after="40" w:line="276" w:lineRule="auto"/>
+              <w:jc w:val="center"/>
+            </w:pPr>
+            <w:r>
+              <w:rPr>
+                <w:rFonts w:ascii="Times New Roman" w:hAnsi="Times New Roman"/>
+                <w:sz w:val="26"/>
+                <w:rFonts w:ascii="Times New Roman" w:hAnsi="Times New Roman" w:cs="Times New Roman"/>
+              </w:rPr>
+              <w:t>1</w:t>
+            </w:r>
+          </w:p>
+        </w:tc>
+        <w:tc>
+          <w:tcPr>
+            <w:tcW w:type="dxa" w:w="1247"/>
+            <w:vAlign w:val="center"/>
+          </w:tcPr>
+          <w:p>
+            <w:pPr>
+              <w:spacing w:before="40" w:after="40" w:line="276" w:lineRule="auto"/>
+              <w:jc w:val="center"/>
+            </w:pPr>
+            <w:r>
+              <w:rPr>
+                <w:rFonts w:ascii="Times New Roman" w:hAnsi="Times New Roman"/>
+                <w:sz w:val="26"/>
+                <w:rFonts w:ascii="Times New Roman" w:hAnsi="Times New Roman" w:cs="Times New Roman"/>
+              </w:rPr>
+              <w:t>15</w:t>
+            </w:r>
+          </w:p>
+        </w:tc>
+        <w:tc>
+          <w:tcPr>
+            <w:tcW w:type="dxa" w:w="3402"/>
+            <w:vAlign w:val="center"/>
+          </w:tcPr>
+          <w:p>
+            <w:pPr>
+              <w:spacing w:before="40" w:after="40" w:line="276" w:lineRule="auto"/>
+              <w:jc w:val="both"/>
+            </w:pPr>
+            <w:r>
+              <w:rPr>
+                <w:rFonts w:ascii="Times New Roman" w:hAnsi="Times New Roman"/>
+                <w:sz w:val="26"/>
+                <w:rFonts w:ascii="Times New Roman" w:hAnsi="Times New Roman" w:cs="Times New Roman"/>
+              </w:rPr>
+              <w:t>- Thao tác hoàn thiện và in bảng tính; thực hành hoàn thiện dự án.  - Sử dụng bảng tính điện tử giải quyết công việc cụ thể.</w:t>
+            </w:r>
+          </w:p>
+        </w:tc>
+      </w:tr>
+      <w:tr>
+        <w:tc>
+          <w:tcPr>
+            <w:tcW w:type="dxa" w:w="680"/>
+            <w:vAlign w:val="center"/>
+          </w:tcPr>
+          <w:p>
+            <w:pPr>
+              <w:spacing w:before="40" w:after="40" w:line="276" w:lineRule="auto"/>
+              <w:jc w:val="center"/>
+            </w:pPr>
+            <w:r>
+              <w:rPr>
+                <w:rFonts w:ascii="Times New Roman" w:hAnsi="Times New Roman"/>
+                <w:sz w:val="26"/>
+                <w:rFonts w:ascii="Times New Roman" w:hAnsi="Times New Roman" w:cs="Times New Roman"/>
+              </w:rPr>
+              <w:t>16</w:t>
+            </w:r>
+          </w:p>
+        </w:tc>
+        <w:tc>
+          <w:tcPr>
+            <w:tcW w:type="dxa" w:w="3118"/>
+            <w:vAlign w:val="center"/>
+          </w:tcPr>
+          <w:p>
+            <w:pPr>
+              <w:spacing w:before="40" w:after="40" w:line="276" w:lineRule="auto"/>
+              <w:jc w:val="both"/>
+            </w:pPr>
+            <w:r>
+              <w:rPr>
+                <w:rFonts w:ascii="Times New Roman" w:hAnsi="Times New Roman"/>
+                <w:sz w:val="26"/>
+                <w:rFonts w:ascii="Times New Roman" w:hAnsi="Times New Roman" w:cs="Times New Roman"/>
+              </w:rPr>
+              <w:t>Bài 11. Tạo bài trình chiếu</w:t>
+            </w:r>
+          </w:p>
+        </w:tc>
+        <w:tc>
+          <w:tcPr>
+            <w:tcW w:type="dxa" w:w="850"/>
+            <w:vAlign w:val="center"/>
+          </w:tcPr>
+          <w:p>
+            <w:pPr>
+              <w:spacing w:before="40" w:after="40" w:line="276" w:lineRule="auto"/>
+              <w:jc w:val="center"/>
+            </w:pPr>
+            <w:r>
+              <w:rPr>
+                <w:rFonts w:ascii="Times New Roman" w:hAnsi="Times New Roman"/>
+                <w:sz w:val="26"/>
+                <w:rFonts w:ascii="Times New Roman" w:hAnsi="Times New Roman" w:cs="Times New Roman"/>
+              </w:rPr>
+              <w:t>1</w:t>
+            </w:r>
+          </w:p>
+        </w:tc>
+        <w:tc>
+          <w:tcPr>
+            <w:tcW w:type="dxa" w:w="1247"/>
+            <w:vAlign w:val="center"/>
+          </w:tcPr>
+          <w:p>
+            <w:pPr>
+              <w:spacing w:before="40" w:after="40" w:line="276" w:lineRule="auto"/>
+              <w:jc w:val="center"/>
+            </w:pPr>
+            <w:r>
+              <w:rPr>
+                <w:rFonts w:ascii="Times New Roman" w:hAnsi="Times New Roman"/>
+                <w:sz w:val="26"/>
+                <w:rFonts w:ascii="Times New Roman" w:hAnsi="Times New Roman" w:cs="Times New Roman"/>
+              </w:rPr>
+              <w:t>16</w:t>
+            </w:r>
+          </w:p>
+        </w:tc>
+        <w:tc>
+          <w:tcPr>
+            <w:tcW w:type="dxa" w:w="3402"/>
+            <w:vAlign w:val="center"/>
+          </w:tcPr>
+          <w:p>
+            <w:pPr>
+              <w:spacing w:before="40" w:after="40" w:line="276" w:lineRule="auto"/>
+              <w:jc w:val="both"/>
+            </w:pPr>
+            <w:r>
+              <w:rPr>
+                <w:rFonts w:ascii="Times New Roman" w:hAnsi="Times New Roman"/>
+                <w:sz w:val="26"/>
+                <w:rFonts w:ascii="Times New Roman" w:hAnsi="Times New Roman" w:cs="Times New Roman"/>
+              </w:rPr>
+              <w:t>- Nêu chức năng cơ bản của phần mềm trình chiếu.  - Tạo bài trình chiếu có tiêu đề, cấu trúc phân cấp.</w:t>
+            </w:r>
+          </w:p>
+        </w:tc>
+      </w:tr>
+      <w:tr>
+        <w:tc>
+          <w:tcPr>
+            <w:tcW w:type="dxa" w:w="680"/>
+            <w:vAlign w:val="center"/>
+          </w:tcPr>
+          <w:p>
+            <w:pPr>
+              <w:spacing w:before="40" w:after="40" w:line="276" w:lineRule="auto"/>
+              <w:jc w:val="center"/>
+            </w:pPr>
+            <w:r>
+              <w:rPr>
+                <w:rFonts w:ascii="Times New Roman" w:hAnsi="Times New Roman"/>
+                <w:sz w:val="26"/>
+                <w:rFonts w:ascii="Times New Roman" w:hAnsi="Times New Roman" w:cs="Times New Roman"/>
+              </w:rPr>
+              <w:t>17</w:t>
+            </w:r>
+          </w:p>
+        </w:tc>
+        <w:tc>
+          <w:tcPr>
+            <w:tcW w:type="dxa" w:w="3118"/>
+            <w:vAlign w:val="center"/>
+          </w:tcPr>
+          <w:p>
+            <w:pPr>
+              <w:spacing w:before="40" w:after="40" w:line="276" w:lineRule="auto"/>
+              <w:jc w:val="both"/>
+            </w:pPr>
+            <w:r>
+              <w:rPr>
+                <w:rFonts w:ascii="Times New Roman" w:hAnsi="Times New Roman"/>
+                <w:sz w:val="26"/>
+                <w:rFonts w:ascii="Times New Roman" w:hAnsi="Times New Roman" w:cs="Times New Roman"/>
+              </w:rPr>
+              <w:t>Bài 12. Định dạng đối tượng trên trang chiếu</w:t>
+            </w:r>
+          </w:p>
+        </w:tc>
+        <w:tc>
+          <w:tcPr>
+            <w:tcW w:type="dxa" w:w="850"/>
+            <w:vAlign w:val="center"/>
+          </w:tcPr>
+          <w:p>
+            <w:pPr>
+              <w:spacing w:before="40" w:after="40" w:line="276" w:lineRule="auto"/>
+              <w:jc w:val="center"/>
+            </w:pPr>
+            <w:r>
+              <w:rPr>
+                <w:rFonts w:ascii="Times New Roman" w:hAnsi="Times New Roman"/>
+                <w:sz w:val="26"/>
+                <w:rFonts w:ascii="Times New Roman" w:hAnsi="Times New Roman" w:cs="Times New Roman"/>
+              </w:rPr>
+              <w:t>1</w:t>
+            </w:r>
+          </w:p>
+        </w:tc>
+        <w:tc>
+          <w:tcPr>
+            <w:tcW w:type="dxa" w:w="1247"/>
+            <w:vAlign w:val="center"/>
+          </w:tcPr>
+          <w:p>
+            <w:pPr>
+              <w:spacing w:before="40" w:after="40" w:line="276" w:lineRule="auto"/>
+              <w:jc w:val="center"/>
+            </w:pPr>
+            <w:r>
+              <w:rPr>
+                <w:rFonts w:ascii="Times New Roman" w:hAnsi="Times New Roman"/>
+                <w:sz w:val="26"/>
+                <w:rFonts w:ascii="Times New Roman" w:hAnsi="Times New Roman" w:cs="Times New Roman"/>
+              </w:rPr>
+              <w:t>17</w:t>
+            </w:r>
+          </w:p>
+        </w:tc>
+        <w:tc>
+          <w:tcPr>
+            <w:tcW w:type="dxa" w:w="3402"/>
+            <w:vAlign w:val="center"/>
+          </w:tcPr>
+          <w:p>
+            <w:pPr>
+              <w:spacing w:before="40" w:after="40" w:line="276" w:lineRule="auto"/>
+              <w:jc w:val="both"/>
+            </w:pPr>
+            <w:r>
+              <w:rPr>
+                <w:rFonts w:ascii="Times New Roman" w:hAnsi="Times New Roman"/>
+                <w:sz w:val="26"/>
+                <w:rFonts w:ascii="Times New Roman" w:hAnsi="Times New Roman" w:cs="Times New Roman"/>
+              </w:rPr>
+              <w:t>- Sao chép dữ liệu từ tệp văn bản sang trang chiếu; chèn hình ảnh minh họa.  - Định dạng văn bản, ảnh minh họa hợp lý.</w:t>
+            </w:r>
+          </w:p>
+        </w:tc>
+      </w:tr>
+      <w:tr>
+        <w:tc>
+          <w:tcPr>
+            <w:tcW w:type="dxa" w:w="680"/>
+            <w:vAlign w:val="center"/>
+          </w:tcPr>
+          <w:p>
+            <w:pPr>
+              <w:spacing w:before="40" w:after="40" w:line="276" w:lineRule="auto"/>
+              <w:jc w:val="center"/>
+            </w:pPr>
+            <w:r>
+              <w:rPr>
+                <w:rFonts w:ascii="Times New Roman" w:hAnsi="Times New Roman"/>
+                <w:sz w:val="26"/>
+                <w:rFonts w:ascii="Times New Roman" w:hAnsi="Times New Roman" w:cs="Times New Roman"/>
+              </w:rPr>
+              <w:t>18</w:t>
+            </w:r>
+          </w:p>
+        </w:tc>
+        <w:tc>
+          <w:tcPr>
+            <w:tcW w:type="dxa" w:w="3118"/>
+            <w:vAlign w:val="center"/>
+          </w:tcPr>
+          <w:p>
+            <w:pPr>
+              <w:spacing w:before="40" w:after="40" w:line="276" w:lineRule="auto"/>
+              <w:jc w:val="both"/>
+            </w:pPr>
+            <w:r>
+              <w:rPr>
+                <w:rFonts w:ascii="Times New Roman" w:hAnsi="Times New Roman"/>
+                <w:sz w:val="26"/>
+                <w:rFonts w:ascii="Times New Roman" w:hAnsi="Times New Roman" w:cs="Times New Roman"/>
+              </w:rPr>
+              <w:t>Bài 13. Thực hành tổng hợp: Hoàn thiện bài trình chiếu</w:t>
+            </w:r>
+          </w:p>
+        </w:tc>
+        <w:tc>
+          <w:tcPr>
+            <w:tcW w:type="dxa" w:w="850"/>
+            <w:vAlign w:val="center"/>
+          </w:tcPr>
+          <w:p>
+            <w:pPr>
+              <w:spacing w:before="40" w:after="40" w:line="276" w:lineRule="auto"/>
+              <w:jc w:val="center"/>
+            </w:pPr>
+            <w:r>
+              <w:rPr>
+                <w:rFonts w:ascii="Times New Roman" w:hAnsi="Times New Roman"/>
+                <w:sz w:val="26"/>
+                <w:rFonts w:ascii="Times New Roman" w:hAnsi="Times New Roman" w:cs="Times New Roman"/>
+              </w:rPr>
+              <w:t>1</w:t>
+            </w:r>
+          </w:p>
+        </w:tc>
+        <w:tc>
+          <w:tcPr>
+            <w:tcW w:type="dxa" w:w="1247"/>
+            <w:vAlign w:val="center"/>
+          </w:tcPr>
+          <w:p>
+            <w:pPr>
+              <w:spacing w:before="40" w:after="40" w:line="276" w:lineRule="auto"/>
+              <w:jc w:val="center"/>
+            </w:pPr>
+            <w:r>
+              <w:rPr>
+                <w:rFonts w:ascii="Times New Roman" w:hAnsi="Times New Roman"/>
+                <w:sz w:val="26"/>
+                <w:rFonts w:ascii="Times New Roman" w:hAnsi="Times New Roman" w:cs="Times New Roman"/>
+              </w:rPr>
+              <w:t>18</w:t>
+            </w:r>
+          </w:p>
+        </w:tc>
+        <w:tc>
+          <w:tcPr>
+            <w:tcW w:type="dxa" w:w="3402"/>
+            <w:vAlign w:val="center"/>
+          </w:tcPr>
+          <w:p>
+            <w:pPr>
+              <w:spacing w:before="40" w:after="40" w:line="276" w:lineRule="auto"/>
+              <w:jc w:val="both"/>
+            </w:pPr>
+            <w:r>
+              <w:rPr>
+                <w:rFonts w:ascii="Times New Roman" w:hAnsi="Times New Roman"/>
+                <w:sz w:val="26"/>
+                <w:rFonts w:ascii="Times New Roman" w:hAnsi="Times New Roman" w:cs="Times New Roman"/>
+              </w:rPr>
+              <w:t>- Tạo hiệu ứng động hợp lý; tổng hợp, sắp xếp nội dung thành bài trình chiếu hoàn chỉnh.</w:t>
+            </w:r>
+          </w:p>
+        </w:tc>
+      </w:tr>
+      <w:tr>
+        <w:tc>
+          <w:tcPr>
+            <w:tcW w:type="dxa" w:w="680"/>
+            <w:vAlign w:val="center"/>
+          </w:tcPr>
+          <w:p>
+            <w:pPr>
+              <w:spacing w:before="40" w:after="40" w:line="276" w:lineRule="auto"/>
+              <w:jc w:val="center"/>
+            </w:pPr>
+            <w:r>
+              <w:rPr>
+                <w:rFonts w:ascii="Times New Roman" w:hAnsi="Times New Roman"/>
+                <w:sz w:val="26"/>
+                <w:rFonts w:ascii="Times New Roman" w:hAnsi="Times New Roman" w:cs="Times New Roman"/>
+              </w:rPr>
+              <w:t>19</w:t>
+            </w:r>
+          </w:p>
+        </w:tc>
+        <w:tc>
+          <w:tcPr>
+            <w:tcW w:type="dxa" w:w="3118"/>
+            <w:vAlign w:val="center"/>
+          </w:tcPr>
+          <w:p>
+            <w:pPr>
+              <w:spacing w:before="40" w:after="40" w:line="276" w:lineRule="auto"/>
+              <w:jc w:val="both"/>
+            </w:pPr>
+            <w:r>
+              <w:rPr>
+                <w:rFonts w:ascii="Times New Roman" w:hAnsi="Times New Roman"/>
+                <w:sz w:val="26"/>
+                <w:rFonts w:ascii="Times New Roman" w:hAnsi="Times New Roman" w:cs="Times New Roman"/>
+              </w:rPr>
+              <w:t>Ôn tập Đánh giá định kỳ 3</w:t>
+            </w:r>
+          </w:p>
+        </w:tc>
+        <w:tc>
+          <w:tcPr>
+            <w:tcW w:type="dxa" w:w="850"/>
+            <w:vAlign w:val="center"/>
+          </w:tcPr>
+          <w:p>
+            <w:pPr>
+              <w:spacing w:before="40" w:after="40" w:line="276" w:lineRule="auto"/>
+              <w:jc w:val="center"/>
+            </w:pPr>
+            <w:r>
+              <w:rPr>
+                <w:rFonts w:ascii="Times New Roman" w:hAnsi="Times New Roman"/>
+                <w:sz w:val="26"/>
+                <w:rFonts w:ascii="Times New Roman" w:hAnsi="Times New Roman" w:cs="Times New Roman"/>
+              </w:rPr>
+              <w:t>1</w:t>
+            </w:r>
+          </w:p>
+        </w:tc>
+        <w:tc>
+          <w:tcPr>
+            <w:tcW w:type="dxa" w:w="1247"/>
+            <w:vAlign w:val="center"/>
+          </w:tcPr>
+          <w:p>
+            <w:pPr>
+              <w:spacing w:before="40" w:after="40" w:line="276" w:lineRule="auto"/>
+              <w:jc w:val="center"/>
+            </w:pPr>
+            <w:r>
+              <w:rPr>
+                <w:rFonts w:ascii="Times New Roman" w:hAnsi="Times New Roman"/>
+                <w:sz w:val="26"/>
+                <w:rFonts w:ascii="Times New Roman" w:hAnsi="Times New Roman" w:cs="Times New Roman"/>
+              </w:rPr>
+              <w:t>19</w:t>
+            </w:r>
+          </w:p>
+        </w:tc>
+        <w:tc>
+          <w:tcPr>
+            <w:tcW w:type="dxa" w:w="3402"/>
+            <w:vAlign w:val="center"/>
+          </w:tcPr>
+          <w:p>
+            <w:pPr>
+              <w:spacing w:before="40" w:after="40" w:line="276" w:lineRule="auto"/>
+              <w:jc w:val="both"/>
+            </w:pPr>
+            <w:r>
+              <w:rPr>
+                <w:rFonts w:ascii="Times New Roman" w:hAnsi="Times New Roman"/>
+                <w:sz w:val="26"/>
+                <w:rFonts w:ascii="Times New Roman" w:hAnsi="Times New Roman" w:cs="Times New Roman"/>
+              </w:rPr>
+              <w:t>Hệ thống hóa kiến thức chuẩn bị Đánh giá định kỳ 3.</w:t>
+            </w:r>
+          </w:p>
+        </w:tc>
+      </w:tr>
+      <w:tr>
+        <w:tc>
+          <w:tcPr>
+            <w:tcW w:type="dxa" w:w="680"/>
+            <w:vAlign w:val="center"/>
+          </w:tcPr>
+          <w:p>
+            <w:pPr>
+              <w:spacing w:before="40" w:after="40" w:line="276" w:lineRule="auto"/>
+              <w:jc w:val="center"/>
+            </w:pPr>
+            <w:r>
+              <w:rPr>
+                <w:rFonts w:ascii="Times New Roman" w:hAnsi="Times New Roman"/>
+                <w:sz w:val="26"/>
+                <w:rFonts w:ascii="Times New Roman" w:hAnsi="Times New Roman" w:cs="Times New Roman"/>
+              </w:rPr>
+              <w:t>20</w:t>
+            </w:r>
+          </w:p>
+        </w:tc>
+        <w:tc>
+          <w:tcPr>
+            <w:tcW w:type="dxa" w:w="3118"/>
+            <w:vAlign w:val="center"/>
+          </w:tcPr>
+          <w:p>
+            <w:pPr>
+              <w:spacing w:before="40" w:after="40" w:line="276" w:lineRule="auto"/>
+              <w:jc w:val="both"/>
+            </w:pPr>
+            <w:r>
+              <w:rPr>
+                <w:rFonts w:ascii="Times New Roman" w:hAnsi="Times New Roman"/>
+                <w:sz w:val="26"/>
+                <w:rFonts w:ascii="Times New Roman" w:hAnsi="Times New Roman" w:cs="Times New Roman"/>
+              </w:rPr>
+              <w:t>Đánh giá định kỳ 3</w:t>
+            </w:r>
+          </w:p>
+        </w:tc>
+        <w:tc>
+          <w:tcPr>
+            <w:tcW w:type="dxa" w:w="850"/>
+            <w:vAlign w:val="center"/>
+          </w:tcPr>
+          <w:p>
+            <w:pPr>
+              <w:spacing w:before="40" w:after="40" w:line="276" w:lineRule="auto"/>
+              <w:jc w:val="center"/>
+            </w:pPr>
+            <w:r>
+              <w:rPr>
+                <w:rFonts w:ascii="Times New Roman" w:hAnsi="Times New Roman"/>
+                <w:sz w:val="26"/>
+                <w:rFonts w:ascii="Times New Roman" w:hAnsi="Times New Roman" w:cs="Times New Roman"/>
+              </w:rPr>
+              <w:t>1</w:t>
+            </w:r>
+          </w:p>
+        </w:tc>
+        <w:tc>
+          <w:tcPr>
+            <w:tcW w:type="dxa" w:w="1247"/>
+            <w:vAlign w:val="center"/>
+          </w:tcPr>
+          <w:p>
+            <w:pPr>
+              <w:spacing w:before="40" w:after="40" w:line="276" w:lineRule="auto"/>
+              <w:jc w:val="center"/>
+            </w:pPr>
+            <w:r>
+              <w:rPr>
+                <w:rFonts w:ascii="Times New Roman" w:hAnsi="Times New Roman"/>
+                <w:sz w:val="26"/>
+                <w:rFonts w:ascii="Times New Roman" w:hAnsi="Times New Roman" w:cs="Times New Roman"/>
+              </w:rPr>
+              <w:t>20</w:t>
+            </w:r>
+          </w:p>
+        </w:tc>
+        <w:tc>
+          <w:tcPr>
+            <w:tcW w:type="dxa" w:w="3402"/>
+            <w:vAlign w:val="center"/>
+          </w:tcPr>
+          <w:p>
+            <w:pPr>
+              <w:spacing w:before="40" w:after="40" w:line="276" w:lineRule="auto"/>
+              <w:jc w:val="both"/>
+            </w:pPr>
+            <w:r>
+              <w:rPr>
+                <w:rFonts w:ascii="Times New Roman" w:hAnsi="Times New Roman"/>
+                <w:sz w:val="26"/>
+                <w:rFonts w:ascii="Times New Roman" w:hAnsi="Times New Roman" w:cs="Times New Roman"/>
+              </w:rPr>
+              <w:t>Kiểm tra đánh giá kết quả học tập.</w:t>
+            </w:r>
+          </w:p>
+        </w:tc>
+      </w:tr>
+      <w:tr>
+        <w:tc>
+          <w:tcPr>
+            <w:tcW w:type="dxa" w:w="680"/>
+            <w:vAlign w:val="center"/>
+          </w:tcPr>
+          <w:p>
+            <w:pPr>
+              <w:spacing w:before="40" w:after="40" w:line="276" w:lineRule="auto"/>
+              <w:jc w:val="center"/>
+            </w:pPr>
+            <w:r>
+              <w:rPr>
+                <w:rFonts w:ascii="Times New Roman" w:hAnsi="Times New Roman"/>
+                <w:sz w:val="26"/>
+                <w:rFonts w:ascii="Times New Roman" w:hAnsi="Times New Roman" w:cs="Times New Roman"/>
+              </w:rPr>
+              <w:t>21</w:t>
+            </w:r>
+          </w:p>
+        </w:tc>
+        <w:tc>
+          <w:tcPr>
+            <w:tcW w:type="dxa" w:w="3118"/>
+            <w:vAlign w:val="center"/>
+          </w:tcPr>
+          <w:p>
+            <w:pPr>
+              <w:spacing w:before="40" w:after="40" w:line="276" w:lineRule="auto"/>
+              <w:jc w:val="both"/>
+            </w:pPr>
+            <w:r>
+              <w:rPr>
+                <w:rFonts w:ascii="Times New Roman" w:hAnsi="Times New Roman"/>
+                <w:sz w:val="26"/>
+                <w:rFonts w:ascii="Times New Roman" w:hAnsi="Times New Roman" w:cs="Times New Roman"/>
+              </w:rPr>
+              <w:t>Ôn tập và luyện tập</w:t>
+            </w:r>
+          </w:p>
+        </w:tc>
+        <w:tc>
+          <w:tcPr>
+            <w:tcW w:type="dxa" w:w="850"/>
+            <w:vAlign w:val="center"/>
+          </w:tcPr>
+          <w:p>
+            <w:pPr>
+              <w:spacing w:before="40" w:after="40" w:line="276" w:lineRule="auto"/>
+              <w:jc w:val="center"/>
+            </w:pPr>
+            <w:r>
+              <w:rPr>
+                <w:rFonts w:ascii="Times New Roman" w:hAnsi="Times New Roman"/>
+                <w:sz w:val="26"/>
+                <w:rFonts w:ascii="Times New Roman" w:hAnsi="Times New Roman" w:cs="Times New Roman"/>
+              </w:rPr>
+              <w:t>1</w:t>
+            </w:r>
+          </w:p>
+        </w:tc>
+        <w:tc>
+          <w:tcPr>
+            <w:tcW w:type="dxa" w:w="1247"/>
+            <w:vAlign w:val="center"/>
+          </w:tcPr>
+          <w:p>
+            <w:pPr>
+              <w:spacing w:before="40" w:after="40" w:line="276" w:lineRule="auto"/>
+              <w:jc w:val="center"/>
+            </w:pPr>
+            <w:r>
+              <w:rPr>
+                <w:rFonts w:ascii="Times New Roman" w:hAnsi="Times New Roman"/>
+                <w:sz w:val="26"/>
+                <w:rFonts w:ascii="Times New Roman" w:hAnsi="Times New Roman" w:cs="Times New Roman"/>
+              </w:rPr>
+              <w:t>21</w:t>
+            </w:r>
+          </w:p>
+        </w:tc>
+        <w:tc>
+          <w:tcPr>
+            <w:tcW w:type="dxa" w:w="3402"/>
+            <w:vAlign w:val="center"/>
+          </w:tcPr>
+          <w:p>
+            <w:pPr>
+              <w:spacing w:before="40" w:after="40" w:line="276" w:lineRule="auto"/>
+              <w:jc w:val="both"/>
+            </w:pPr>
+            <w:r>
+              <w:rPr>
+                <w:rFonts w:ascii="Times New Roman" w:hAnsi="Times New Roman"/>
+                <w:sz w:val="26"/>
+                <w:rFonts w:ascii="Times New Roman" w:hAnsi="Times New Roman" w:cs="Times New Roman"/>
+              </w:rPr>
+              <w:t>Ôn tập, luyện tập bổ sung kiến thức và kỹ năng.</w:t>
+            </w:r>
+          </w:p>
+        </w:tc>
+      </w:tr>
+      <w:tr>
+        <w:tc>
+          <w:tcPr>
+            <w:tcW w:type="dxa" w:w="680"/>
+            <w:vAlign w:val="center"/>
+          </w:tcPr>
+          <w:p>
+            <w:pPr>
+              <w:spacing w:before="40" w:after="40" w:line="276" w:lineRule="auto"/>
+              <w:jc w:val="center"/>
+            </w:pPr>
+            <w:r>
+              <w:rPr>
+                <w:rFonts w:ascii="Times New Roman" w:hAnsi="Times New Roman"/>
+                <w:sz w:val="26"/>
+                <w:rFonts w:ascii="Times New Roman" w:hAnsi="Times New Roman" w:cs="Times New Roman"/>
+              </w:rPr>
+              <w:t>22</w:t>
+            </w:r>
+          </w:p>
+        </w:tc>
+        <w:tc>
+          <w:tcPr>
+            <w:tcW w:type="dxa" w:w="3118"/>
+            <w:vAlign w:val="center"/>
+          </w:tcPr>
+          <w:p>
+            <w:pPr>
+              <w:spacing w:before="40" w:after="40" w:line="276" w:lineRule="auto"/>
+              <w:jc w:val="both"/>
+            </w:pPr>
+            <w:r>
+              <w:rPr>
+                <w:rFonts w:ascii="Times New Roman" w:hAnsi="Times New Roman"/>
+                <w:sz w:val="26"/>
+                <w:rFonts w:ascii="Times New Roman" w:hAnsi="Times New Roman" w:cs="Times New Roman"/>
+              </w:rPr>
+              <w:t>Ôn tập Đánh giá định kỳ 4</w:t>
+            </w:r>
+          </w:p>
+        </w:tc>
+        <w:tc>
+          <w:tcPr>
+            <w:tcW w:type="dxa" w:w="850"/>
+            <w:vAlign w:val="center"/>
+          </w:tcPr>
+          <w:p>
+            <w:pPr>
+              <w:spacing w:before="40" w:after="40" w:line="276" w:lineRule="auto"/>
+              <w:jc w:val="center"/>
+            </w:pPr>
+            <w:r>
+              <w:rPr>
+                <w:rFonts w:ascii="Times New Roman" w:hAnsi="Times New Roman"/>
+                <w:sz w:val="26"/>
+                <w:rFonts w:ascii="Times New Roman" w:hAnsi="Times New Roman" w:cs="Times New Roman"/>
+              </w:rPr>
+              <w:t>1</w:t>
+            </w:r>
+          </w:p>
+        </w:tc>
+        <w:tc>
+          <w:tcPr>
+            <w:tcW w:type="dxa" w:w="1247"/>
+            <w:vAlign w:val="center"/>
+          </w:tcPr>
+          <w:p>
+            <w:pPr>
+              <w:spacing w:before="40" w:after="40" w:line="276" w:lineRule="auto"/>
+              <w:jc w:val="center"/>
+            </w:pPr>
+            <w:r>
+              <w:rPr>
+                <w:rFonts w:ascii="Times New Roman" w:hAnsi="Times New Roman"/>
+                <w:sz w:val="26"/>
+                <w:rFonts w:ascii="Times New Roman" w:hAnsi="Times New Roman" w:cs="Times New Roman"/>
+              </w:rPr>
+              <w:t>22</w:t>
+            </w:r>
+          </w:p>
+        </w:tc>
+        <w:tc>
+          <w:tcPr>
+            <w:tcW w:type="dxa" w:w="3402"/>
+            <w:vAlign w:val="center"/>
+          </w:tcPr>
+          <w:p>
+            <w:pPr>
+              <w:spacing w:before="40" w:after="40" w:line="276" w:lineRule="auto"/>
+              <w:jc w:val="both"/>
+            </w:pPr>
+            <w:r>
+              <w:rPr>
+                <w:rFonts w:ascii="Times New Roman" w:hAnsi="Times New Roman"/>
+                <w:sz w:val="26"/>
+                <w:rFonts w:ascii="Times New Roman" w:hAnsi="Times New Roman" w:cs="Times New Roman"/>
+              </w:rPr>
+              <w:t>Hệ thống hóa kiến thức chuẩn bị Đánh giá định kỳ 4.</w:t>
+            </w:r>
+          </w:p>
+        </w:tc>
+      </w:tr>
+      <w:tr>
+        <w:tc>
+          <w:tcPr>
+            <w:tcW w:type="dxa" w:w="680"/>
+            <w:vAlign w:val="center"/>
+          </w:tcPr>
+          <w:p>
+            <w:pPr>
+              <w:spacing w:before="40" w:after="40" w:line="276" w:lineRule="auto"/>
+              <w:jc w:val="center"/>
+            </w:pPr>
+            <w:r>
+              <w:rPr>
+                <w:rFonts w:ascii="Times New Roman" w:hAnsi="Times New Roman"/>
+                <w:sz w:val="26"/>
+                <w:rFonts w:ascii="Times New Roman" w:hAnsi="Times New Roman" w:cs="Times New Roman"/>
+              </w:rPr>
+              <w:t>23</w:t>
+            </w:r>
+          </w:p>
+        </w:tc>
+        <w:tc>
+          <w:tcPr>
+            <w:tcW w:type="dxa" w:w="3118"/>
+            <w:vAlign w:val="center"/>
+          </w:tcPr>
+          <w:p>
+            <w:pPr>
+              <w:spacing w:before="40" w:after="40" w:line="276" w:lineRule="auto"/>
+              <w:jc w:val="both"/>
+            </w:pPr>
+            <w:r>
+              <w:rPr>
+                <w:rFonts w:ascii="Times New Roman" w:hAnsi="Times New Roman"/>
+                <w:sz w:val="26"/>
+                <w:rFonts w:ascii="Times New Roman" w:hAnsi="Times New Roman" w:cs="Times New Roman"/>
+              </w:rPr>
+              <w:t>Đánh giá định kỳ 4</w:t>
+            </w:r>
+          </w:p>
+        </w:tc>
+        <w:tc>
+          <w:tcPr>
+            <w:tcW w:type="dxa" w:w="850"/>
+            <w:vAlign w:val="center"/>
+          </w:tcPr>
+          <w:p>
+            <w:pPr>
+              <w:spacing w:before="40" w:after="40" w:line="276" w:lineRule="auto"/>
+              <w:jc w:val="center"/>
+            </w:pPr>
+            <w:r>
+              <w:rPr>
+                <w:rFonts w:ascii="Times New Roman" w:hAnsi="Times New Roman"/>
+                <w:sz w:val="26"/>
+                <w:rFonts w:ascii="Times New Roman" w:hAnsi="Times New Roman" w:cs="Times New Roman"/>
+              </w:rPr>
+              <w:t>1</w:t>
+            </w:r>
+          </w:p>
+        </w:tc>
+        <w:tc>
+          <w:tcPr>
+            <w:tcW w:type="dxa" w:w="1247"/>
+            <w:vAlign w:val="center"/>
+          </w:tcPr>
+          <w:p>
+            <w:pPr>
+              <w:spacing w:before="40" w:after="40" w:line="276" w:lineRule="auto"/>
+              <w:jc w:val="center"/>
+            </w:pPr>
+            <w:r>
+              <w:rPr>
+                <w:rFonts w:ascii="Times New Roman" w:hAnsi="Times New Roman"/>
+                <w:sz w:val="26"/>
+                <w:rFonts w:ascii="Times New Roman" w:hAnsi="Times New Roman" w:cs="Times New Roman"/>
+              </w:rPr>
+              <w:t>23</w:t>
+            </w:r>
+          </w:p>
+        </w:tc>
+        <w:tc>
+          <w:tcPr>
+            <w:tcW w:type="dxa" w:w="3402"/>
+            <w:vAlign w:val="center"/>
+          </w:tcPr>
+          <w:p>
+            <w:pPr>
+              <w:spacing w:before="40" w:after="40" w:line="276" w:lineRule="auto"/>
+              <w:jc w:val="both"/>
+            </w:pPr>
+            <w:r>
+              <w:rPr>
+                <w:rFonts w:ascii="Times New Roman" w:hAnsi="Times New Roman"/>
+                <w:sz w:val="26"/>
+                <w:rFonts w:ascii="Times New Roman" w:hAnsi="Times New Roman" w:cs="Times New Roman"/>
+              </w:rPr>
+              <w:t>Kiểm tra đánh giá kết quả học tập.</w:t>
+            </w:r>
+          </w:p>
+        </w:tc>
+      </w:tr>
+      <w:tr>
+        <w:tc>
+          <w:tcPr>
+            <w:tcW w:type="dxa" w:w="680"/>
+            <w:vAlign w:val="center"/>
+          </w:tcPr>
+          <w:p>
+            <w:pPr>
+              <w:spacing w:before="40" w:after="40" w:line="276" w:lineRule="auto"/>
+              <w:jc w:val="center"/>
+            </w:pPr>
+            <w:r>
+              <w:rPr>
+                <w:rFonts w:ascii="Times New Roman" w:hAnsi="Times New Roman"/>
+                <w:sz w:val="26"/>
+                <w:rFonts w:ascii="Times New Roman" w:hAnsi="Times New Roman" w:cs="Times New Roman"/>
+              </w:rPr>
+              <w:t>24</w:t>
+            </w:r>
+          </w:p>
+        </w:tc>
+        <w:tc>
+          <w:tcPr>
+            <w:tcW w:type="dxa" w:w="3118"/>
+            <w:vAlign w:val="center"/>
+          </w:tcPr>
+          <w:p>
+            <w:pPr>
+              <w:spacing w:before="40" w:after="40" w:line="276" w:lineRule="auto"/>
+              <w:jc w:val="both"/>
+            </w:pPr>
+            <w:r>
+              <w:rPr>
+                <w:rFonts w:ascii="Times New Roman" w:hAnsi="Times New Roman"/>
+                <w:sz w:val="26"/>
+                <w:rFonts w:ascii="Times New Roman" w:hAnsi="Times New Roman" w:cs="Times New Roman"/>
+              </w:rPr>
+              <w:t>Tổng kết năm học</w:t>
+            </w:r>
+          </w:p>
+        </w:tc>
+        <w:tc>
+          <w:tcPr>
+            <w:tcW w:type="dxa" w:w="850"/>
+            <w:vAlign w:val="center"/>
+          </w:tcPr>
+          <w:p>
+            <w:pPr>
+              <w:spacing w:before="40" w:after="40" w:line="276" w:lineRule="auto"/>
+              <w:jc w:val="center"/>
+            </w:pPr>
+            <w:r>
+              <w:rPr>
+                <w:rFonts w:ascii="Times New Roman" w:hAnsi="Times New Roman"/>
+                <w:sz w:val="26"/>
+                <w:rFonts w:ascii="Times New Roman" w:hAnsi="Times New Roman" w:cs="Times New Roman"/>
+              </w:rPr>
+              <w:t>1</w:t>
+            </w:r>
+          </w:p>
+        </w:tc>
+        <w:tc>
+          <w:tcPr>
+            <w:tcW w:type="dxa" w:w="1247"/>
+            <w:vAlign w:val="center"/>
+          </w:tcPr>
+          <w:p>
+            <w:pPr>
+              <w:spacing w:before="40" w:after="40" w:line="276" w:lineRule="auto"/>
+              <w:jc w:val="center"/>
+            </w:pPr>
+            <w:r>
+              <w:rPr>
+                <w:rFonts w:ascii="Times New Roman" w:hAnsi="Times New Roman"/>
+                <w:sz w:val="26"/>
+                <w:rFonts w:ascii="Times New Roman" w:hAnsi="Times New Roman" w:cs="Times New Roman"/>
+              </w:rPr>
+              <w:t>24</w:t>
+            </w:r>
+          </w:p>
+        </w:tc>
+        <w:tc>
+          <w:tcPr>
+            <w:tcW w:type="dxa" w:w="3402"/>
+            <w:vAlign w:val="center"/>
+          </w:tcPr>
+          <w:p>
+            <w:pPr>
+              <w:spacing w:before="40" w:after="40" w:line="276" w:lineRule="auto"/>
+              <w:jc w:val="both"/>
+            </w:pPr>
+            <w:r>
+              <w:rPr>
+                <w:rFonts w:ascii="Times New Roman" w:hAnsi="Times New Roman"/>
+                <w:sz w:val="26"/>
+                <w:rFonts w:ascii="Times New Roman" w:hAnsi="Times New Roman" w:cs="Times New Roman"/>
+              </w:rPr>
+              <w:t>Tổng kết đánh giá kết quả học tập cả năm.</w:t>
+            </w:r>
+          </w:p>
+        </w:tc>
+      </w:tr>
+    </w:tbl>
     <w:p>
       <w:pPr>
         <w:rPr>
@@ -1420,2249 +4093,6 @@
         <w:t>7</w:t>
       </w:r>
     </w:p>
-    <w:tbl>
-      <w:tblPr>
-        <w:tblW w:w="9351" w:type="dxa"/>
-        <w:tblBorders>
-          <w:top w:val="single" w:sz="4" w:space="0" w:color="000000"/>
-          <w:left w:val="single" w:sz="4" w:space="0" w:color="000000"/>
-          <w:bottom w:val="single" w:sz="4" w:space="0" w:color="000000"/>
-          <w:right w:val="single" w:sz="4" w:space="0" w:color="000000"/>
-          <w:insideH w:val="single" w:sz="4" w:space="0" w:color="000000"/>
-          <w:insideV w:val="single" w:sz="4" w:space="0" w:color="000000"/>
-        </w:tblBorders>
-        <w:tblLayout w:type="fixed"/>
-        <w:tblLook w:val="0400" w:firstRow="0" w:lastRow="0" w:firstColumn="0" w:lastColumn="0" w:noHBand="0" w:noVBand="1"/>
-      </w:tblPr>
-      <w:tblGrid>
-        <w:gridCol w:w="838"/>
-        <w:gridCol w:w="3126"/>
-        <w:gridCol w:w="1134"/>
-        <w:gridCol w:w="4253"/>
-      </w:tblGrid>
-      <w:tr>
-        <w:tc>
-          <w:tcPr>
-            <w:tcW w:w="838" w:type="dxa"/>
-          </w:tcPr>
-          <w:p>
-            <w:pPr>
-              <w:spacing w:before="20" w:after="20"/>
-              <w:jc w:val="center"/>
-            </w:pPr>
-            <w:r>
-              <w:rPr>
-                <w:rFonts w:ascii="Times New Roman" w:hAnsi="Times New Roman"/>
-                <w:b/>
-                <w:sz w:val="26"/>
-                <w:rFonts w:ascii="Times New Roman" w:hAnsi="Times New Roman" w:cs="Times New Roman"/>
-              </w:rPr>
-              <w:t>STT</w:t>
-            </w:r>
-          </w:p>
-        </w:tc>
-        <w:tc>
-          <w:tcPr>
-            <w:tcW w:w="3126" w:type="dxa"/>
-          </w:tcPr>
-          <w:p>
-            <w:pPr>
-              <w:spacing w:before="20" w:after="20"/>
-              <w:jc w:val="center"/>
-            </w:pPr>
-            <w:r>
-              <w:rPr>
-                <w:rFonts w:ascii="Times New Roman" w:hAnsi="Times New Roman"/>
-                <w:b/>
-                <w:sz w:val="26"/>
-                <w:rFonts w:ascii="Times New Roman" w:hAnsi="Times New Roman" w:cs="Times New Roman"/>
-              </w:rPr>
-              <w:t>Bài học (1)</w:t>
-            </w:r>
-          </w:p>
-        </w:tc>
-        <w:tc>
-          <w:tcPr>
-            <w:tcW w:w="1134" w:type="dxa"/>
-          </w:tcPr>
-          <w:p>
-            <w:pPr>
-              <w:spacing w:before="20" w:after="20"/>
-              <w:jc w:val="center"/>
-            </w:pPr>
-            <w:r>
-              <w:rPr>
-                <w:rFonts w:ascii="Times New Roman" w:hAnsi="Times New Roman"/>
-                <w:b/>
-                <w:sz w:val="26"/>
-                <w:rFonts w:ascii="Times New Roman" w:hAnsi="Times New Roman" w:cs="Times New Roman"/>
-              </w:rPr>
-              <w:t>Số tiết (2)</w:t>
-            </w:r>
-          </w:p>
-        </w:tc>
-        <w:tc>
-          <w:tcPr>
-            <w:tcW w:w="4253" w:type="dxa"/>
-          </w:tcPr>
-          <w:p>
-            <w:pPr>
-              <w:spacing w:before="20" w:after="20"/>
-              <w:jc w:val="center"/>
-            </w:pPr>
-            <w:r>
-              <w:rPr>
-                <w:rFonts w:ascii="Times New Roman" w:hAnsi="Times New Roman"/>
-                <w:b/>
-                <w:sz w:val="26"/>
-                <w:rFonts w:ascii="Times New Roman" w:hAnsi="Times New Roman" w:cs="Times New Roman"/>
-              </w:rPr>
-              <w:t>Yêu cầu cần đạt (3)</w:t>
-            </w:r>
-          </w:p>
-        </w:tc>
-      </w:tr>
-      <w:tr>
-        <w:tc>
-          <w:tcPr>
-            <w:tcW w:type="dxa" w:w="838"/>
-          </w:tcPr>
-          <w:p>
-            <w:pPr>
-              <w:jc w:val="center"/>
-            </w:pPr>
-            <w:r>
-              <w:rPr>
-                <w:rFonts w:ascii="Times New Roman" w:hAnsi="Times New Roman"/>
-                <w:b w:val="0"/>
-                <w:sz w:val="26"/>
-                <w:rFonts w:ascii="Times New Roman" w:hAnsi="Times New Roman" w:cs="Times New Roman"/>
-                <w:rFonts w:ascii="Times New Roman" w:hAnsi="Times New Roman" w:cs="Times New Roman"/>
-              </w:rPr>
-              <w:t>0</w:t>
-            </w:r>
-          </w:p>
-        </w:tc>
-        <w:tc>
-          <w:tcPr>
-            <w:tcW w:type="dxa" w:w="3126"/>
-          </w:tcPr>
-          <w:p>
-            <w:r>
-              <w:rPr>
-                <w:rFonts w:ascii="Times New Roman" w:hAnsi="Times New Roman"/>
-                <w:b w:val="0"/>
-                <w:sz w:val="26"/>
-                <w:rFonts w:ascii="Times New Roman" w:hAnsi="Times New Roman" w:cs="Times New Roman"/>
-                <w:rFonts w:ascii="Times New Roman" w:hAnsi="Times New Roman" w:cs="Times New Roman"/>
-              </w:rPr>
-              <w:t>Tiết 0: Định hướng môn học</w:t>
-            </w:r>
-          </w:p>
-        </w:tc>
-        <w:tc>
-          <w:tcPr>
-            <w:tcW w:type="dxa" w:w="1134"/>
-          </w:tcPr>
-          <w:p>
-            <w:pPr>
-              <w:jc w:val="center"/>
-            </w:pPr>
-            <w:r>
-              <w:rPr>
-                <w:rFonts w:ascii="Times New Roman" w:hAnsi="Times New Roman"/>
-                <w:b w:val="0"/>
-                <w:sz w:val="26"/>
-                <w:rFonts w:ascii="Times New Roman" w:hAnsi="Times New Roman" w:cs="Times New Roman"/>
-                <w:rFonts w:ascii="Times New Roman" w:hAnsi="Times New Roman" w:cs="Times New Roman"/>
-              </w:rPr>
-              <w:t>0</w:t>
-            </w:r>
-          </w:p>
-        </w:tc>
-        <w:tc>
-          <w:tcPr>
-            <w:tcW w:type="dxa" w:w="4253"/>
-          </w:tcPr>
-          <w:p>
-            <w:r>
-              <w:rPr>
-                <w:rFonts w:ascii="Times New Roman" w:hAnsi="Times New Roman"/>
-                <w:b w:val="0"/>
-                <w:sz w:val="26"/>
-                <w:rFonts w:ascii="Times New Roman" w:hAnsi="Times New Roman" w:cs="Times New Roman"/>
-                <w:rFonts w:ascii="Times New Roman" w:hAnsi="Times New Roman" w:cs="Times New Roman"/>
-              </w:rPr>
-              <w:t>Giới thiệu tổng quan môn học Tin học, phương pháp học tập hiệu quả, các quy định an toàn và nội quy phòng học bộ môn.</w:t>
-            </w:r>
-          </w:p>
-        </w:tc>
-      </w:tr>
-      <w:tr>
-        <w:tc>
-          <w:tcPr>
-            <w:tcW w:w="838" w:type="dxa"/>
-          </w:tcPr>
-          <w:p>
-            <w:pPr>
-              <w:spacing w:before="20" w:after="20"/>
-              <w:jc w:val="center"/>
-            </w:pPr>
-            <w:r>
-              <w:rPr>
-                <w:rFonts w:ascii="Times New Roman" w:hAnsi="Times New Roman"/>
-                <w:sz w:val="26"/>
-                <w:rFonts w:ascii="Times New Roman" w:hAnsi="Times New Roman" w:cs="Times New Roman"/>
-              </w:rPr>
-              <w:t>1</w:t>
-            </w:r>
-          </w:p>
-        </w:tc>
-        <w:tc>
-          <w:tcPr>
-            <w:tcW w:w="3126" w:type="dxa"/>
-          </w:tcPr>
-          <w:p>
-            <w:pPr>
-              <w:spacing w:before="20" w:after="20"/>
-            </w:pPr>
-            <w:r>
-              <w:rPr>
-                <w:rFonts w:ascii="Times New Roman" w:hAnsi="Times New Roman"/>
-                <w:sz w:val="26"/>
-                <w:rFonts w:ascii="Times New Roman" w:hAnsi="Times New Roman" w:cs="Times New Roman"/>
-              </w:rPr>
-              <w:t>Chủ đề 1: Máy tính và cộng đồng</w:t>
-            </w:r>
-          </w:p>
-        </w:tc>
-        <w:tc>
-          <w:tcPr>
-            <w:tcW w:w="1134" w:type="dxa"/>
-          </w:tcPr>
-          <w:p>
-            <w:pPr>
-              <w:spacing w:before="20" w:after="20"/>
-              <w:jc w:val="center"/>
-            </w:pPr>
-            <w:r>
-              <w:rPr>
-                <w:rFonts w:ascii="Times New Roman" w:hAnsi="Times New Roman"/>
-                <w:sz w:val="26"/>
-                <w:rFonts w:ascii="Times New Roman" w:hAnsi="Times New Roman" w:cs="Times New Roman"/>
-              </w:rPr>
-              <w:t>1</w:t>
-            </w:r>
-          </w:p>
-        </w:tc>
-        <w:tc>
-          <w:tcPr>
-            <w:tcW w:w="4253" w:type="dxa"/>
-          </w:tcPr>
-          <w:p>
-            <w:pPr>
-              <w:spacing w:before="20" w:after="20"/>
-            </w:pPr>
-          </w:p>
-        </w:tc>
-      </w:tr>
-      <w:tr>
-        <w:tc>
-          <w:tcPr>
-            <w:tcW w:w="838" w:type="dxa"/>
-          </w:tcPr>
-          <w:p>
-            <w:pPr>
-              <w:spacing w:before="20" w:after="20"/>
-              <w:jc w:val="center"/>
-            </w:pPr>
-            <w:r>
-              <w:rPr>
-                <w:rFonts w:ascii="Times New Roman" w:hAnsi="Times New Roman"/>
-                <w:sz w:val="26"/>
-                <w:rFonts w:ascii="Times New Roman" w:hAnsi="Times New Roman" w:cs="Times New Roman"/>
-              </w:rPr>
-              <w:t>2</w:t>
-            </w:r>
-          </w:p>
-        </w:tc>
-        <w:tc>
-          <w:tcPr>
-            <w:tcW w:w="3126" w:type="dxa"/>
-          </w:tcPr>
-          <w:p>
-            <w:pPr>
-              <w:spacing w:before="20" w:after="20"/>
-            </w:pPr>
-            <w:r>
-              <w:rPr>
-                <w:rFonts w:ascii="Times New Roman" w:hAnsi="Times New Roman"/>
-                <w:sz w:val="26"/>
-                <w:rFonts w:ascii="Times New Roman" w:hAnsi="Times New Roman" w:cs="Times New Roman"/>
-              </w:rPr>
-              <w:t>Bài 1. Thiết bị vào - ra</w:t>
-            </w:r>
-          </w:p>
-        </w:tc>
-        <w:tc>
-          <w:tcPr>
-            <w:tcW w:w="1134" w:type="dxa"/>
-          </w:tcPr>
-          <w:p>
-            <w:pPr>
-              <w:spacing w:before="20" w:after="20"/>
-              <w:jc w:val="center"/>
-            </w:pPr>
-            <w:r>
-              <w:rPr>
-                <w:rFonts w:ascii="Times New Roman" w:hAnsi="Times New Roman"/>
-                <w:sz w:val="26"/>
-                <w:rFonts w:ascii="Times New Roman" w:hAnsi="Times New Roman" w:cs="Times New Roman"/>
-              </w:rPr>
-              <w:t>2</w:t>
-            </w:r>
-          </w:p>
-        </w:tc>
-        <w:tc>
-          <w:tcPr>
-            <w:tcW w:w="4253" w:type="dxa"/>
-          </w:tcPr>
-          <w:p>
-            <w:pPr>
-              <w:spacing w:before="20" w:after="20"/>
-            </w:pPr>
-            <w:r>
-              <w:rPr>
-                <w:rFonts w:ascii="Times New Roman" w:hAnsi="Times New Roman"/>
-                <w:sz w:val="26"/>
-                <w:rFonts w:ascii="Times New Roman" w:hAnsi="Times New Roman" w:cs="Times New Roman"/>
-              </w:rPr>
-              <w:t>- Củng cố, phát triển kiến thức xử lý thông tin.  - Nhận biết thiết bị vào - ra có nhiều loại/hình dạng; hiểu chức năng trong thu nhận, lưu trữ, xử lý, truyền thông tin.  - Nêu ví dụ về thao tác không đúng cách gây lỗi thiết bị.</w:t>
-            </w:r>
-          </w:p>
-        </w:tc>
-      </w:tr>
-      <w:tr>
-        <w:tc>
-          <w:tcPr>
-            <w:tcW w:w="838" w:type="dxa"/>
-          </w:tcPr>
-          <w:p>
-            <w:pPr>
-              <w:spacing w:before="20" w:after="20"/>
-              <w:jc w:val="center"/>
-            </w:pPr>
-            <w:r>
-              <w:rPr>
-                <w:rFonts w:ascii="Times New Roman" w:hAnsi="Times New Roman"/>
-                <w:sz w:val="26"/>
-                <w:rFonts w:ascii="Times New Roman" w:hAnsi="Times New Roman" w:cs="Times New Roman"/>
-              </w:rPr>
-              <w:t>3</w:t>
-            </w:r>
-          </w:p>
-        </w:tc>
-        <w:tc>
-          <w:tcPr>
-            <w:tcW w:w="3126" w:type="dxa"/>
-          </w:tcPr>
-          <w:p>
-            <w:pPr>
-              <w:spacing w:before="20" w:after="20"/>
-            </w:pPr>
-            <w:r>
-              <w:rPr>
-                <w:rFonts w:ascii="Times New Roman" w:hAnsi="Times New Roman"/>
-                <w:sz w:val="26"/>
-                <w:rFonts w:ascii="Times New Roman" w:hAnsi="Times New Roman" w:cs="Times New Roman"/>
-              </w:rPr>
-              <w:t>Bài 2. Phần mềm máy tính</w:t>
-            </w:r>
-          </w:p>
-        </w:tc>
-        <w:tc>
-          <w:tcPr>
-            <w:tcW w:w="1134" w:type="dxa"/>
-          </w:tcPr>
-          <w:p>
-            <w:pPr>
-              <w:spacing w:before="20" w:after="20"/>
-              <w:jc w:val="center"/>
-            </w:pPr>
-            <w:r>
-              <w:rPr>
-                <w:rFonts w:ascii="Times New Roman" w:hAnsi="Times New Roman"/>
-                <w:sz w:val="26"/>
-                <w:rFonts w:ascii="Times New Roman" w:hAnsi="Times New Roman" w:cs="Times New Roman"/>
-              </w:rPr>
-              <w:t>3</w:t>
-            </w:r>
-          </w:p>
-        </w:tc>
-        <w:tc>
-          <w:tcPr>
-            <w:tcW w:w="4253" w:type="dxa"/>
-          </w:tcPr>
-          <w:p>
-            <w:pPr>
-              <w:spacing w:before="20" w:after="20"/>
-            </w:pPr>
-            <w:r>
-              <w:rPr>
-                <w:rFonts w:ascii="Times New Roman" w:hAnsi="Times New Roman"/>
-                <w:sz w:val="26"/>
-                <w:rFonts w:ascii="Times New Roman" w:hAnsi="Times New Roman" w:cs="Times New Roman"/>
-              </w:rPr>
-              <w:t>- Nhận thức vai trò của phần mềm trong hoạt động của máy tính.  - Phân loại phần mềm thành: hệ điều hành và phần mềm ứng dụng.</w:t>
-            </w:r>
-          </w:p>
-        </w:tc>
-      </w:tr>
-      <w:tr>
-        <w:tc>
-          <w:tcPr>
-            <w:tcW w:w="838" w:type="dxa"/>
-          </w:tcPr>
-          <w:p>
-            <w:pPr>
-              <w:spacing w:before="20" w:after="20"/>
-              <w:jc w:val="center"/>
-            </w:pPr>
-            <w:r>
-              <w:rPr>
-                <w:rFonts w:ascii="Times New Roman" w:hAnsi="Times New Roman"/>
-                <w:sz w:val="26"/>
-                <w:rFonts w:ascii="Times New Roman" w:hAnsi="Times New Roman" w:cs="Times New Roman"/>
-              </w:rPr>
-              <w:t>4</w:t>
-            </w:r>
-          </w:p>
-        </w:tc>
-        <w:tc>
-          <w:tcPr>
-            <w:tcW w:w="3126" w:type="dxa"/>
-          </w:tcPr>
-          <w:p>
-            <w:pPr>
-              <w:spacing w:before="20" w:after="20"/>
-            </w:pPr>
-            <w:r>
-              <w:rPr>
-                <w:rFonts w:ascii="Times New Roman" w:hAnsi="Times New Roman"/>
-                <w:sz w:val="26"/>
-                <w:rFonts w:ascii="Times New Roman" w:hAnsi="Times New Roman" w:cs="Times New Roman"/>
-              </w:rPr>
-              <w:t>Bài 3. Quản lý dữ liệu trong máy tính</w:t>
-            </w:r>
-          </w:p>
-        </w:tc>
-        <w:tc>
-          <w:tcPr>
-            <w:tcW w:w="1134" w:type="dxa"/>
-          </w:tcPr>
-          <w:p>
-            <w:pPr>
-              <w:spacing w:before="20" w:after="20"/>
-              <w:jc w:val="center"/>
-            </w:pPr>
-            <w:r>
-              <w:rPr>
-                <w:rFonts w:ascii="Times New Roman" w:hAnsi="Times New Roman"/>
-                <w:sz w:val="26"/>
-                <w:rFonts w:ascii="Times New Roman" w:hAnsi="Times New Roman" w:cs="Times New Roman"/>
-              </w:rPr>
-              <w:t>4, 5</w:t>
-            </w:r>
-          </w:p>
-        </w:tc>
-        <w:tc>
-          <w:tcPr>
-            <w:tcW w:w="4253" w:type="dxa"/>
-          </w:tcPr>
-          <w:p>
-            <w:pPr>
-              <w:spacing w:before="20" w:after="20"/>
-            </w:pPr>
-            <w:r>
-              <w:rPr>
-                <w:rFonts w:ascii="Times New Roman" w:hAnsi="Times New Roman"/>
-                <w:sz w:val="26"/>
-                <w:rFonts w:ascii="Times New Roman" w:hAnsi="Times New Roman" w:cs="Times New Roman"/>
-              </w:rPr>
-              <w:t>- Biết tệp chương trình cũng là dữ liệu lưu trữ trong máy tính.  - Nêu ví dụ biện pháp an toàn dữ liệu: sao lưu, phòng chống xâm nhập trái phép, virus,...</w:t>
-            </w:r>
-          </w:p>
-        </w:tc>
-      </w:tr>
-      <w:tr>
-        <w:tc>
-          <w:tcPr>
-            <w:tcW w:w="838" w:type="dxa"/>
-          </w:tcPr>
-          <w:p>
-            <w:pPr>
-              <w:spacing w:before="20" w:after="20"/>
-              <w:jc w:val="center"/>
-            </w:pPr>
-            <w:r>
-              <w:rPr>
-                <w:rFonts w:ascii="Times New Roman" w:hAnsi="Times New Roman"/>
-                <w:sz w:val="26"/>
-                <w:rFonts w:ascii="Times New Roman" w:hAnsi="Times New Roman" w:cs="Times New Roman"/>
-              </w:rPr>
-              <w:t>5</w:t>
-            </w:r>
-          </w:p>
-        </w:tc>
-        <w:tc>
-          <w:tcPr>
-            <w:tcW w:w="3126" w:type="dxa"/>
-          </w:tcPr>
-          <w:p>
-            <w:pPr>
-              <w:spacing w:before="20" w:after="20"/>
-            </w:pPr>
-            <w:r>
-              <w:rPr>
-                <w:rFonts w:ascii="Times New Roman" w:hAnsi="Times New Roman"/>
-                <w:sz w:val="26"/>
-                <w:rFonts w:ascii="Times New Roman" w:hAnsi="Times New Roman" w:cs="Times New Roman"/>
-              </w:rPr>
-              <w:t>Chủ đề 2: Tổ chức lưu trữ, tìm kiếm và trao đổi thông tin</w:t>
-            </w:r>
-          </w:p>
-        </w:tc>
-        <w:tc>
-          <w:tcPr>
-            <w:tcW w:w="1134" w:type="dxa"/>
-          </w:tcPr>
-          <w:p>
-            <w:pPr>
-              <w:spacing w:before="20" w:after="20"/>
-              <w:jc w:val="center"/>
-            </w:pPr>
-            <w:r>
-              <w:rPr>
-                <w:rFonts w:ascii="Times New Roman" w:hAnsi="Times New Roman"/>
-                <w:sz w:val="26"/>
-                <w:rFonts w:ascii="Times New Roman" w:hAnsi="Times New Roman" w:cs="Times New Roman"/>
-              </w:rPr>
-              <w:t>6</w:t>
-            </w:r>
-          </w:p>
-        </w:tc>
-        <w:tc>
-          <w:tcPr>
-            <w:tcW w:w="4253" w:type="dxa"/>
-          </w:tcPr>
-          <w:p>
-            <w:pPr>
-              <w:spacing w:before="20" w:after="20"/>
-            </w:pPr>
-          </w:p>
-        </w:tc>
-      </w:tr>
-      <w:tr>
-        <w:tc>
-          <w:tcPr>
-            <w:tcW w:w="838" w:type="dxa"/>
-          </w:tcPr>
-          <w:p>
-            <w:pPr>
-              <w:spacing w:before="20" w:after="20"/>
-              <w:jc w:val="center"/>
-            </w:pPr>
-            <w:r>
-              <w:rPr>
-                <w:rFonts w:ascii="Times New Roman" w:hAnsi="Times New Roman"/>
-                <w:sz w:val="26"/>
-                <w:rFonts w:ascii="Times New Roman" w:hAnsi="Times New Roman" w:cs="Times New Roman"/>
-              </w:rPr>
-              <w:t>6</w:t>
-            </w:r>
-          </w:p>
-        </w:tc>
-        <w:tc>
-          <w:tcPr>
-            <w:tcW w:w="3126" w:type="dxa"/>
-          </w:tcPr>
-          <w:p>
-            <w:pPr>
-              <w:spacing w:before="20" w:after="20"/>
-            </w:pPr>
-            <w:r>
-              <w:rPr>
-                <w:rFonts w:ascii="Times New Roman" w:hAnsi="Times New Roman"/>
-                <w:sz w:val="26"/>
-                <w:rFonts w:ascii="Times New Roman" w:hAnsi="Times New Roman" w:cs="Times New Roman"/>
-              </w:rPr>
-              <w:t>Bài 4. Mạng xã hội và một số kênh trao đổi thông tin trên Internet</w:t>
-            </w:r>
-          </w:p>
-        </w:tc>
-        <w:tc>
-          <w:tcPr>
-            <w:tcW w:w="1134" w:type="dxa"/>
-          </w:tcPr>
-          <w:p>
-            <w:pPr>
-              <w:spacing w:before="20" w:after="20"/>
-              <w:jc w:val="center"/>
-            </w:pPr>
-            <w:r>
-              <w:rPr>
-                <w:rFonts w:ascii="Times New Roman" w:hAnsi="Times New Roman"/>
-                <w:sz w:val="26"/>
-                <w:rFonts w:ascii="Times New Roman" w:hAnsi="Times New Roman" w:cs="Times New Roman"/>
-              </w:rPr>
-              <w:t>7, 8</w:t>
-            </w:r>
-          </w:p>
-        </w:tc>
-        <w:tc>
-          <w:tcPr>
-            <w:tcW w:w="4253" w:type="dxa"/>
-          </w:tcPr>
-          <w:p>
-            <w:pPr>
-              <w:spacing w:before="20" w:after="20"/>
-            </w:pPr>
-            <w:r>
-              <w:rPr>
-                <w:rFonts w:ascii="Times New Roman" w:hAnsi="Times New Roman"/>
-                <w:sz w:val="26"/>
-                <w:rFonts w:ascii="Times New Roman" w:hAnsi="Times New Roman" w:cs="Times New Roman"/>
-              </w:rPr>
-              <w:t xml:space="preserve">- Nêu chức năng cơ bản của mạng xã hội; nhận biết các website mạng xã hội và sử dụng chức năng giao lưu, chia sẻ.  </w:t>
-            </w:r>
-            <w:r>
-              <w:rPr>
-                <w:rFonts w:ascii="Times New Roman" w:hAnsi="Times New Roman"/>
-                <w:sz w:val="26"/>
-                <w:rFonts w:ascii="Times New Roman" w:hAnsi="Times New Roman" w:cs="Times New Roman"/>
-              </w:rPr>
-              <w:lastRenderedPageBreak/>
-              <w:t>- Nêu tên kênh trao đổi thông tin thông dụng; nêu hậu quả việc dùng thông tin sai trái.</w:t>
-            </w:r>
-          </w:p>
-        </w:tc>
-      </w:tr>
-      <w:tr>
-        <w:tc>
-          <w:tcPr>
-            <w:tcW w:w="838" w:type="dxa"/>
-          </w:tcPr>
-          <w:p>
-            <w:pPr>
-              <w:spacing w:before="20" w:after="20"/>
-              <w:jc w:val="center"/>
-            </w:pPr>
-            <w:r>
-              <w:rPr>
-                <w:rFonts w:ascii="Times New Roman" w:hAnsi="Times New Roman"/>
-                <w:b/>
-                <w:sz w:val="26"/>
-                <w:rFonts w:ascii="Times New Roman" w:hAnsi="Times New Roman" w:cs="Times New Roman"/>
-              </w:rPr>
-              <w:lastRenderedPageBreak/>
-              <w:t>7</w:t>
-            </w:r>
-          </w:p>
-        </w:tc>
-        <w:tc>
-          <w:tcPr>
-            <w:tcW w:w="3126" w:type="dxa"/>
-          </w:tcPr>
-          <w:p>
-            <w:pPr>
-              <w:spacing w:before="20" w:after="20"/>
-            </w:pPr>
-            <w:r>
-              <w:rPr>
-                <w:rFonts w:ascii="Times New Roman" w:hAnsi="Times New Roman"/>
-                <w:b/>
-                <w:sz w:val="26"/>
-                <w:rFonts w:ascii="Times New Roman" w:hAnsi="Times New Roman" w:cs="Times New Roman"/>
-              </w:rPr>
-              <w:t>Ôn tập Đánh giá định kỳ 1</w:t>
-            </w:r>
-          </w:p>
-        </w:tc>
-        <w:tc>
-          <w:tcPr>
-            <w:tcW w:w="1134" w:type="dxa"/>
-          </w:tcPr>
-          <w:p>
-            <w:pPr>
-              <w:spacing w:before="20" w:after="20"/>
-              <w:jc w:val="center"/>
-            </w:pPr>
-            <w:r>
-              <w:rPr>
-                <w:rFonts w:ascii="Times New Roman" w:hAnsi="Times New Roman"/>
-                <w:b/>
-                <w:sz w:val="26"/>
-                <w:rFonts w:ascii="Times New Roman" w:hAnsi="Times New Roman" w:cs="Times New Roman"/>
-              </w:rPr>
-              <w:t>9</w:t>
-            </w:r>
-          </w:p>
-        </w:tc>
-        <w:tc>
-          <w:tcPr>
-            <w:tcW w:w="4253" w:type="dxa"/>
-          </w:tcPr>
-          <w:p>
-            <w:pPr>
-              <w:spacing w:before="20" w:after="20"/>
-            </w:pPr>
-            <w:r>
-              <w:rPr>
-                <w:rFonts w:ascii="Times New Roman" w:hAnsi="Times New Roman"/>
-                <w:sz w:val="26"/>
-                <w:rFonts w:ascii="Times New Roman" w:hAnsi="Times New Roman" w:cs="Times New Roman"/>
-              </w:rPr>
-              <w:t>Hệ thống hóa kiến thức chuẩn bị Đánh giá định kỳ 1.</w:t>
-            </w:r>
-          </w:p>
-        </w:tc>
-      </w:tr>
-      <w:tr>
-        <w:tc>
-          <w:tcPr>
-            <w:tcW w:w="838" w:type="dxa"/>
-          </w:tcPr>
-          <w:p>
-            <w:pPr>
-              <w:spacing w:before="20" w:after="20"/>
-              <w:jc w:val="center"/>
-            </w:pPr>
-            <w:r>
-              <w:rPr>
-                <w:rFonts w:ascii="Times New Roman" w:hAnsi="Times New Roman"/>
-                <w:b/>
-                <w:sz w:val="26"/>
-                <w:rFonts w:ascii="Times New Roman" w:hAnsi="Times New Roman" w:cs="Times New Roman"/>
-              </w:rPr>
-              <w:t>8</w:t>
-            </w:r>
-          </w:p>
-        </w:tc>
-        <w:tc>
-          <w:tcPr>
-            <w:tcW w:w="3126" w:type="dxa"/>
-          </w:tcPr>
-          <w:p>
-            <w:pPr>
-              <w:spacing w:before="20" w:after="20"/>
-            </w:pPr>
-            <w:r>
-              <w:rPr>
-                <w:rFonts w:ascii="Times New Roman" w:hAnsi="Times New Roman"/>
-                <w:b/>
-                <w:sz w:val="26"/>
-                <w:rFonts w:ascii="Times New Roman" w:hAnsi="Times New Roman" w:cs="Times New Roman"/>
-              </w:rPr>
-              <w:t>Đánh giá định kỳ 1</w:t>
-            </w:r>
-          </w:p>
-        </w:tc>
-        <w:tc>
-          <w:tcPr>
-            <w:tcW w:w="1134" w:type="dxa"/>
-          </w:tcPr>
-          <w:p>
-            <w:pPr>
-              <w:spacing w:before="20" w:after="20"/>
-              <w:jc w:val="center"/>
-            </w:pPr>
-            <w:r>
-              <w:rPr>
-                <w:rFonts w:ascii="Times New Roman" w:hAnsi="Times New Roman"/>
-                <w:b/>
-                <w:sz w:val="26"/>
-                <w:rFonts w:ascii="Times New Roman" w:hAnsi="Times New Roman" w:cs="Times New Roman"/>
-              </w:rPr>
-              <w:t>10</w:t>
-            </w:r>
-          </w:p>
-        </w:tc>
-        <w:tc>
-          <w:tcPr>
-            <w:tcW w:w="4253" w:type="dxa"/>
-          </w:tcPr>
-          <w:p>
-            <w:pPr>
-              <w:spacing w:before="20" w:after="20"/>
-            </w:pPr>
-            <w:r>
-              <w:rPr>
-                <w:rFonts w:ascii="Times New Roman" w:hAnsi="Times New Roman"/>
-                <w:sz w:val="26"/>
-                <w:rFonts w:ascii="Times New Roman" w:hAnsi="Times New Roman" w:cs="Times New Roman"/>
-              </w:rPr>
-              <w:t>Kiểm tra đánh giá kết quả học tập.</w:t>
-            </w:r>
-          </w:p>
-        </w:tc>
-      </w:tr>
-      <w:tr>
-        <w:tc>
-          <w:tcPr>
-            <w:tcW w:w="838" w:type="dxa"/>
-          </w:tcPr>
-          <w:p>
-            <w:pPr>
-              <w:spacing w:before="20" w:after="20"/>
-              <w:jc w:val="center"/>
-            </w:pPr>
-            <w:r>
-              <w:rPr>
-                <w:rFonts w:ascii="Times New Roman" w:hAnsi="Times New Roman"/>
-                <w:sz w:val="26"/>
-                <w:rFonts w:ascii="Times New Roman" w:hAnsi="Times New Roman" w:cs="Times New Roman"/>
-              </w:rPr>
-              <w:t>9</w:t>
-            </w:r>
-          </w:p>
-        </w:tc>
-        <w:tc>
-          <w:tcPr>
-            <w:tcW w:w="3126" w:type="dxa"/>
-          </w:tcPr>
-          <w:p>
-            <w:pPr>
-              <w:spacing w:before="20" w:after="20"/>
-            </w:pPr>
-            <w:r>
-              <w:rPr>
-                <w:rFonts w:ascii="Times New Roman" w:hAnsi="Times New Roman"/>
-                <w:sz w:val="26"/>
-                <w:rFonts w:ascii="Times New Roman" w:hAnsi="Times New Roman" w:cs="Times New Roman"/>
-              </w:rPr>
-              <w:t>Chủ đề 3: Đạo đức, pháp luật và văn hóa trong môi trường số</w:t>
-            </w:r>
-          </w:p>
-        </w:tc>
-        <w:tc>
-          <w:tcPr>
-            <w:tcW w:w="1134" w:type="dxa"/>
-          </w:tcPr>
-          <w:p>
-            <w:pPr>
-              <w:spacing w:before="20" w:after="20"/>
-              <w:jc w:val="center"/>
-            </w:pPr>
-            <w:r>
-              <w:rPr>
-                <w:rFonts w:ascii="Times New Roman" w:hAnsi="Times New Roman"/>
-                <w:sz w:val="26"/>
-                <w:rFonts w:ascii="Times New Roman" w:hAnsi="Times New Roman" w:cs="Times New Roman"/>
-              </w:rPr>
-              <w:t>11</w:t>
-            </w:r>
-          </w:p>
-        </w:tc>
-        <w:tc>
-          <w:tcPr>
-            <w:tcW w:w="4253" w:type="dxa"/>
-          </w:tcPr>
-          <w:p>
-            <w:pPr>
-              <w:spacing w:before="20" w:after="20"/>
-            </w:pPr>
-          </w:p>
-        </w:tc>
-      </w:tr>
-      <w:tr>
-        <w:tc>
-          <w:tcPr>
-            <w:tcW w:w="838" w:type="dxa"/>
-          </w:tcPr>
-          <w:p>
-            <w:pPr>
-              <w:spacing w:before="20" w:after="20"/>
-              <w:jc w:val="center"/>
-            </w:pPr>
-            <w:r>
-              <w:rPr>
-                <w:rFonts w:ascii="Times New Roman" w:hAnsi="Times New Roman"/>
-                <w:sz w:val="26"/>
-                <w:rFonts w:ascii="Times New Roman" w:hAnsi="Times New Roman" w:cs="Times New Roman"/>
-              </w:rPr>
-              <w:t>10</w:t>
-            </w:r>
-          </w:p>
-        </w:tc>
-        <w:tc>
-          <w:tcPr>
-            <w:tcW w:w="3126" w:type="dxa"/>
-          </w:tcPr>
-          <w:p>
-            <w:pPr>
-              <w:spacing w:before="20" w:after="20"/>
-            </w:pPr>
-            <w:r>
-              <w:rPr>
-                <w:rFonts w:ascii="Times New Roman" w:hAnsi="Times New Roman"/>
-                <w:sz w:val="26"/>
-                <w:rFonts w:ascii="Times New Roman" w:hAnsi="Times New Roman" w:cs="Times New Roman"/>
-              </w:rPr>
-              <w:t>Bài 5. Ứng xử trên mạng</w:t>
-            </w:r>
-          </w:p>
-        </w:tc>
-        <w:tc>
-          <w:tcPr>
-            <w:tcW w:w="1134" w:type="dxa"/>
-          </w:tcPr>
-          <w:p>
-            <w:pPr>
-              <w:spacing w:before="20" w:after="20"/>
-              <w:jc w:val="center"/>
-            </w:pPr>
-            <w:r>
-              <w:rPr>
-                <w:rFonts w:ascii="Times New Roman" w:hAnsi="Times New Roman"/>
-                <w:sz w:val="26"/>
-                <w:rFonts w:ascii="Times New Roman" w:hAnsi="Times New Roman" w:cs="Times New Roman"/>
-              </w:rPr>
-              <w:t>12</w:t>
-            </w:r>
-          </w:p>
-        </w:tc>
-        <w:tc>
-          <w:tcPr>
-            <w:tcW w:w="4253" w:type="dxa"/>
-          </w:tcPr>
-          <w:p>
-            <w:pPr>
-              <w:spacing w:before="20" w:after="20"/>
-            </w:pPr>
-            <w:r>
-              <w:rPr>
-                <w:rFonts w:ascii="Times New Roman" w:hAnsi="Times New Roman"/>
-                <w:sz w:val="26"/>
-                <w:rFonts w:ascii="Times New Roman" w:hAnsi="Times New Roman" w:cs="Times New Roman"/>
-              </w:rPr>
-              <w:t>- Giao tiếp qua mạng đúng quy tắc, lịch sự, có văn hóa.  - Biết tác hại của bệnh nghiện Internet để phòng tránh; biết nhờ người lớn giúp đỡ khi cần.</w:t>
-            </w:r>
-          </w:p>
-        </w:tc>
-      </w:tr>
-      <w:tr>
-        <w:tc>
-          <w:tcPr>
-            <w:tcW w:w="838" w:type="dxa"/>
-          </w:tcPr>
-          <w:p>
-            <w:pPr>
-              <w:spacing w:before="20" w:after="20"/>
-              <w:jc w:val="center"/>
-            </w:pPr>
-            <w:r>
-              <w:rPr>
-                <w:rFonts w:ascii="Times New Roman" w:hAnsi="Times New Roman"/>
-                <w:sz w:val="26"/>
-                <w:rFonts w:ascii="Times New Roman" w:hAnsi="Times New Roman" w:cs="Times New Roman"/>
-              </w:rPr>
-              <w:t>11</w:t>
-            </w:r>
-          </w:p>
-        </w:tc>
-        <w:tc>
-          <w:tcPr>
-            <w:tcW w:w="3126" w:type="dxa"/>
-          </w:tcPr>
-          <w:p>
-            <w:pPr>
-              <w:spacing w:before="20" w:after="20"/>
-            </w:pPr>
-            <w:r>
-              <w:rPr>
-                <w:rFonts w:ascii="Times New Roman" w:hAnsi="Times New Roman"/>
-                <w:sz w:val="26"/>
-                <w:rFonts w:ascii="Times New Roman" w:hAnsi="Times New Roman" w:cs="Times New Roman"/>
-              </w:rPr>
-              <w:t>Chủ đề 4: Ứng dụng tin học</w:t>
-            </w:r>
-          </w:p>
-        </w:tc>
-        <w:tc>
-          <w:tcPr>
-            <w:tcW w:w="1134" w:type="dxa"/>
-          </w:tcPr>
-          <w:p>
-            <w:pPr>
-              <w:spacing w:before="20" w:after="20"/>
-              <w:jc w:val="center"/>
-            </w:pPr>
-            <w:r>
-              <w:rPr>
-                <w:rFonts w:ascii="Times New Roman" w:hAnsi="Times New Roman"/>
-                <w:sz w:val="26"/>
-                <w:rFonts w:ascii="Times New Roman" w:hAnsi="Times New Roman" w:cs="Times New Roman"/>
-              </w:rPr>
-              <w:t>13</w:t>
-            </w:r>
-          </w:p>
-        </w:tc>
-        <w:tc>
-          <w:tcPr>
-            <w:tcW w:w="4253" w:type="dxa"/>
-          </w:tcPr>
-          <w:p>
-            <w:pPr>
-              <w:spacing w:before="20" w:after="20"/>
-            </w:pPr>
-          </w:p>
-        </w:tc>
-      </w:tr>
-      <w:tr>
-        <w:tc>
-          <w:tcPr>
-            <w:tcW w:w="838" w:type="dxa"/>
-          </w:tcPr>
-          <w:p>
-            <w:pPr>
-              <w:spacing w:before="20" w:after="20"/>
-              <w:jc w:val="center"/>
-            </w:pPr>
-            <w:r>
-              <w:rPr>
-                <w:rFonts w:ascii="Times New Roman" w:hAnsi="Times New Roman"/>
-                <w:sz w:val="26"/>
-                <w:rFonts w:ascii="Times New Roman" w:hAnsi="Times New Roman" w:cs="Times New Roman"/>
-              </w:rPr>
-              <w:t>12</w:t>
-            </w:r>
-          </w:p>
-        </w:tc>
-        <w:tc>
-          <w:tcPr>
-            <w:tcW w:w="3126" w:type="dxa"/>
-          </w:tcPr>
-          <w:p>
-            <w:pPr>
-              <w:spacing w:before="20" w:after="20"/>
-            </w:pPr>
-            <w:r>
-              <w:rPr>
-                <w:rFonts w:ascii="Times New Roman" w:hAnsi="Times New Roman"/>
-                <w:sz w:val="26"/>
-                <w:rFonts w:ascii="Times New Roman" w:hAnsi="Times New Roman" w:cs="Times New Roman"/>
-              </w:rPr>
-              <w:t>Bài 6. Làm quen với phần mềm bảng tính</w:t>
-            </w:r>
-          </w:p>
-        </w:tc>
-        <w:tc>
-          <w:tcPr>
-            <w:tcW w:w="1134" w:type="dxa"/>
-          </w:tcPr>
-          <w:p>
-            <w:pPr>
-              <w:spacing w:before="20" w:after="20"/>
-              <w:jc w:val="center"/>
-            </w:pPr>
-            <w:r>
-              <w:rPr>
-                <w:rFonts w:ascii="Times New Roman" w:hAnsi="Times New Roman"/>
-                <w:sz w:val="26"/>
-                <w:rFonts w:ascii="Times New Roman" w:hAnsi="Times New Roman" w:cs="Times New Roman"/>
-              </w:rPr>
-              <w:t>14</w:t>
-            </w:r>
-          </w:p>
-        </w:tc>
-        <w:tc>
-          <w:tcPr>
-            <w:tcW w:w="4253" w:type="dxa"/>
-          </w:tcPr>
-          <w:p>
-            <w:pPr>
-              <w:spacing w:before="20" w:after="20"/>
-            </w:pPr>
-            <w:r>
-              <w:rPr>
-                <w:rFonts w:ascii="Times New Roman" w:hAnsi="Times New Roman"/>
-                <w:sz w:val="26"/>
-                <w:rFonts w:ascii="Times New Roman" w:hAnsi="Times New Roman" w:cs="Times New Roman"/>
-              </w:rPr>
-              <w:t>- Nhận biết khái niệm/chức năng cơ bản của phần mềm bảng tính.  - Nhập, điều chỉnh dữ liệu đơn giản; thay đổi phông chữ, màu nền, căn chỉnh ô tính, độ rộng cột.</w:t>
-            </w:r>
-          </w:p>
-        </w:tc>
-      </w:tr>
-      <w:tr>
-        <w:tc>
-          <w:tcPr>
-            <w:tcW w:w="838" w:type="dxa"/>
-          </w:tcPr>
-          <w:p>
-            <w:pPr>
-              <w:spacing w:before="20" w:after="20"/>
-              <w:jc w:val="center"/>
-            </w:pPr>
-            <w:r>
-              <w:rPr>
-                <w:rFonts w:ascii="Times New Roman" w:hAnsi="Times New Roman"/>
-                <w:sz w:val="26"/>
-                <w:rFonts w:ascii="Times New Roman" w:hAnsi="Times New Roman" w:cs="Times New Roman"/>
-              </w:rPr>
-              <w:t>13</w:t>
-            </w:r>
-          </w:p>
-        </w:tc>
-        <w:tc>
-          <w:tcPr>
-            <w:tcW w:w="3126" w:type="dxa"/>
-          </w:tcPr>
-          <w:p>
-            <w:pPr>
-              <w:spacing w:before="20" w:after="20"/>
-            </w:pPr>
-            <w:r>
-              <w:rPr>
-                <w:rFonts w:ascii="Times New Roman" w:hAnsi="Times New Roman"/>
-                <w:sz w:val="26"/>
-                <w:rFonts w:ascii="Times New Roman" w:hAnsi="Times New Roman" w:cs="Times New Roman"/>
-              </w:rPr>
-              <w:t>Bài 7. Tính toán tự động trên bảng tính</w:t>
-            </w:r>
-          </w:p>
-        </w:tc>
-        <w:tc>
-          <w:tcPr>
-            <w:tcW w:w="1134" w:type="dxa"/>
-          </w:tcPr>
-          <w:p>
-            <w:pPr>
-              <w:spacing w:before="20" w:after="20"/>
-              <w:jc w:val="center"/>
-            </w:pPr>
-            <w:r>
-              <w:rPr>
-                <w:rFonts w:ascii="Times New Roman" w:hAnsi="Times New Roman"/>
-                <w:sz w:val="26"/>
-                <w:rFonts w:ascii="Times New Roman" w:hAnsi="Times New Roman" w:cs="Times New Roman"/>
-              </w:rPr>
-              <w:t>15, 16</w:t>
-            </w:r>
-          </w:p>
-        </w:tc>
-        <w:tc>
-          <w:tcPr>
-            <w:tcW w:w="4253" w:type="dxa"/>
-          </w:tcPr>
-          <w:p>
-            <w:pPr>
-              <w:spacing w:before="20" w:after="20"/>
-            </w:pPr>
-            <w:r>
-              <w:rPr>
-                <w:rFonts w:ascii="Times New Roman" w:hAnsi="Times New Roman"/>
-                <w:sz w:val="26"/>
-                <w:rFonts w:ascii="Times New Roman" w:hAnsi="Times New Roman" w:cs="Times New Roman"/>
-              </w:rPr>
-              <w:t>- Nhận biết kiểu dữ liệu; biết nhập và sao chép công thức trên bảng tính.  - Giải thích việc đưa công thức vào bảng tính là cách điều khiển tính toán tự động.</w:t>
-            </w:r>
-          </w:p>
-        </w:tc>
-      </w:tr>
-      <w:tr>
-        <w:tc>
-          <w:tcPr>
-            <w:tcW w:w="838" w:type="dxa"/>
-          </w:tcPr>
-          <w:p>
-            <w:pPr>
-              <w:spacing w:before="20" w:after="20"/>
-              <w:jc w:val="center"/>
-            </w:pPr>
-            <w:r>
-              <w:rPr>
-                <w:rFonts w:ascii="Times New Roman" w:hAnsi="Times New Roman"/>
-                <w:sz w:val="26"/>
-                <w:rFonts w:ascii="Times New Roman" w:hAnsi="Times New Roman" w:cs="Times New Roman"/>
-              </w:rPr>
-              <w:t>14</w:t>
-            </w:r>
-          </w:p>
-        </w:tc>
-        <w:tc>
-          <w:tcPr>
-            <w:tcW w:w="3126" w:type="dxa"/>
-          </w:tcPr>
-          <w:p>
-            <w:pPr>
-              <w:spacing w:before="20" w:after="20"/>
-            </w:pPr>
-            <w:r>
-              <w:rPr>
-                <w:rFonts w:ascii="Times New Roman" w:hAnsi="Times New Roman"/>
-                <w:sz w:val="26"/>
-                <w:rFonts w:ascii="Times New Roman" w:hAnsi="Times New Roman" w:cs="Times New Roman"/>
-              </w:rPr>
-              <w:t>Bài 8. Công cụ hỗ trợ tính toán</w:t>
-            </w:r>
-          </w:p>
-        </w:tc>
-        <w:tc>
-          <w:tcPr>
-            <w:tcW w:w="1134" w:type="dxa"/>
-          </w:tcPr>
-          <w:p>
-            <w:pPr>
-              <w:spacing w:before="20" w:after="20"/>
-              <w:jc w:val="center"/>
-            </w:pPr>
-            <w:r>
-              <w:rPr>
-                <w:rFonts w:ascii="Times New Roman" w:hAnsi="Times New Roman"/>
-                <w:sz w:val="26"/>
-                <w:rFonts w:ascii="Times New Roman" w:hAnsi="Times New Roman" w:cs="Times New Roman"/>
-              </w:rPr>
-              <w:t>17</w:t>
-            </w:r>
-          </w:p>
-        </w:tc>
-        <w:tc>
-          <w:tcPr>
-            <w:tcW w:w="4253" w:type="dxa"/>
-          </w:tcPr>
-          <w:p>
-            <w:pPr>
-              <w:spacing w:before="20" w:after="20"/>
-            </w:pPr>
-            <w:r>
-              <w:rPr>
-                <w:rFonts w:ascii="Times New Roman" w:hAnsi="Times New Roman"/>
-                <w:sz w:val="26"/>
-                <w:rFonts w:ascii="Times New Roman" w:hAnsi="Times New Roman" w:cs="Times New Roman"/>
-              </w:rPr>
-              <w:t>- Thực hiện phép toán thông dụng; sử dụng hàm đơn giản: MAX, MIN, AVERAGE, COUNT,...</w:t>
-            </w:r>
-          </w:p>
-        </w:tc>
-      </w:tr>
-      <w:tr>
-        <w:tc>
-          <w:tcPr>
-            <w:tcW w:w="838" w:type="dxa"/>
-          </w:tcPr>
-          <w:p>
-            <w:pPr>
-              <w:spacing w:before="20" w:after="20"/>
-              <w:jc w:val="center"/>
-            </w:pPr>
-            <w:r>
-              <w:rPr>
-                <w:rFonts w:ascii="Times New Roman" w:hAnsi="Times New Roman"/>
-                <w:b/>
-                <w:sz w:val="26"/>
-                <w:rFonts w:ascii="Times New Roman" w:hAnsi="Times New Roman" w:cs="Times New Roman"/>
-              </w:rPr>
-              <w:t>15</w:t>
-            </w:r>
-          </w:p>
-        </w:tc>
-        <w:tc>
-          <w:tcPr>
-            <w:tcW w:w="3126" w:type="dxa"/>
-          </w:tcPr>
-          <w:p>
-            <w:pPr>
-              <w:spacing w:before="20" w:after="20"/>
-            </w:pPr>
-            <w:r>
-              <w:rPr>
-                <w:rFonts w:ascii="Times New Roman" w:hAnsi="Times New Roman"/>
-                <w:b/>
-                <w:sz w:val="26"/>
-                <w:rFonts w:ascii="Times New Roman" w:hAnsi="Times New Roman" w:cs="Times New Roman"/>
-              </w:rPr>
-              <w:t>Ôn tập Đánh giá định kỳ 2</w:t>
-            </w:r>
-          </w:p>
-        </w:tc>
-        <w:tc>
-          <w:tcPr>
-            <w:tcW w:w="1134" w:type="dxa"/>
-          </w:tcPr>
-          <w:p>
-            <w:pPr>
-              <w:spacing w:before="20" w:after="20"/>
-              <w:jc w:val="center"/>
-            </w:pPr>
-            <w:r>
-              <w:rPr>
-                <w:rFonts w:ascii="Times New Roman" w:hAnsi="Times New Roman"/>
-                <w:b/>
-                <w:sz w:val="26"/>
-                <w:rFonts w:ascii="Times New Roman" w:hAnsi="Times New Roman" w:cs="Times New Roman"/>
-              </w:rPr>
-              <w:t>18</w:t>
-            </w:r>
-          </w:p>
-        </w:tc>
-        <w:tc>
-          <w:tcPr>
-            <w:tcW w:w="4253" w:type="dxa"/>
-          </w:tcPr>
-          <w:p>
-            <w:pPr>
-              <w:spacing w:before="20" w:after="20"/>
-            </w:pPr>
-            <w:r>
-              <w:rPr>
-                <w:rFonts w:ascii="Times New Roman" w:hAnsi="Times New Roman"/>
-                <w:sz w:val="26"/>
-                <w:rFonts w:ascii="Times New Roman" w:hAnsi="Times New Roman" w:cs="Times New Roman"/>
-              </w:rPr>
-              <w:t>Hệ thống hóa kiến thức chuẩn bị Đánh giá định kỳ 2.</w:t>
-            </w:r>
-          </w:p>
-        </w:tc>
-      </w:tr>
-      <w:tr>
-        <w:tc>
-          <w:tcPr>
-            <w:tcW w:w="838" w:type="dxa"/>
-          </w:tcPr>
-          <w:p>
-            <w:pPr>
-              <w:spacing w:before="20" w:after="20"/>
-              <w:jc w:val="center"/>
-            </w:pPr>
-            <w:r>
-              <w:rPr>
-                <w:rFonts w:ascii="Times New Roman" w:hAnsi="Times New Roman"/>
-                <w:b/>
-                <w:sz w:val="26"/>
-                <w:rFonts w:ascii="Times New Roman" w:hAnsi="Times New Roman" w:cs="Times New Roman"/>
-              </w:rPr>
-              <w:t>16</w:t>
-            </w:r>
-          </w:p>
-        </w:tc>
-        <w:tc>
-          <w:tcPr>
-            <w:tcW w:w="3126" w:type="dxa"/>
-          </w:tcPr>
-          <w:p>
-            <w:pPr>
-              <w:spacing w:before="20" w:after="20"/>
-            </w:pPr>
-            <w:r>
-              <w:rPr>
-                <w:rFonts w:ascii="Times New Roman" w:hAnsi="Times New Roman"/>
-                <w:b/>
-                <w:sz w:val="26"/>
-                <w:rFonts w:ascii="Times New Roman" w:hAnsi="Times New Roman" w:cs="Times New Roman"/>
-              </w:rPr>
-              <w:t>Đánh giá định kỳ 2</w:t>
-            </w:r>
-          </w:p>
-        </w:tc>
-        <w:tc>
-          <w:tcPr>
-            <w:tcW w:w="1134" w:type="dxa"/>
-          </w:tcPr>
-          <w:p>
-            <w:pPr>
-              <w:spacing w:before="20" w:after="20"/>
-              <w:jc w:val="center"/>
-            </w:pPr>
-            <w:r>
-              <w:rPr>
-                <w:rFonts w:ascii="Times New Roman" w:hAnsi="Times New Roman"/>
-                <w:b/>
-                <w:sz w:val="26"/>
-                <w:rFonts w:ascii="Times New Roman" w:hAnsi="Times New Roman" w:cs="Times New Roman"/>
-              </w:rPr>
-              <w:t>19</w:t>
-            </w:r>
-          </w:p>
-        </w:tc>
-        <w:tc>
-          <w:tcPr>
-            <w:tcW w:w="4253" w:type="dxa"/>
-          </w:tcPr>
-          <w:p>
-            <w:pPr>
-              <w:spacing w:before="20" w:after="20"/>
-            </w:pPr>
-            <w:r>
-              <w:rPr>
-                <w:rFonts w:ascii="Times New Roman" w:hAnsi="Times New Roman"/>
-                <w:sz w:val="26"/>
-                <w:rFonts w:ascii="Times New Roman" w:hAnsi="Times New Roman" w:cs="Times New Roman"/>
-              </w:rPr>
-              <w:t>Kiểm tra đánh giá kết quả học tập.</w:t>
-            </w:r>
-          </w:p>
-        </w:tc>
-      </w:tr>
-      <w:tr>
-        <w:tc>
-          <w:tcPr>
-            <w:tcW w:w="838" w:type="dxa"/>
-          </w:tcPr>
-          <w:p>
-            <w:pPr>
-              <w:spacing w:before="20" w:after="20"/>
-              <w:jc w:val="center"/>
-            </w:pPr>
-            <w:r>
-              <w:rPr>
-                <w:rFonts w:ascii="Times New Roman" w:hAnsi="Times New Roman"/>
-                <w:sz w:val="26"/>
-                <w:rFonts w:ascii="Times New Roman" w:hAnsi="Times New Roman" w:cs="Times New Roman"/>
-              </w:rPr>
-              <w:t>17</w:t>
-            </w:r>
-          </w:p>
-        </w:tc>
-        <w:tc>
-          <w:tcPr>
-            <w:tcW w:w="3126" w:type="dxa"/>
-          </w:tcPr>
-          <w:p>
-            <w:pPr>
-              <w:spacing w:before="20" w:after="20"/>
-            </w:pPr>
-            <w:r>
-              <w:rPr>
-                <w:rFonts w:ascii="Times New Roman" w:hAnsi="Times New Roman"/>
-                <w:sz w:val="26"/>
-                <w:rFonts w:ascii="Times New Roman" w:hAnsi="Times New Roman" w:cs="Times New Roman"/>
-              </w:rPr>
-              <w:t>Bài 9. Trình bày bảng tính</w:t>
-            </w:r>
-          </w:p>
-        </w:tc>
-        <w:tc>
-          <w:tcPr>
-            <w:tcW w:w="1134" w:type="dxa"/>
-          </w:tcPr>
-          <w:p>
-            <w:pPr>
-              <w:spacing w:before="20" w:after="20"/>
-              <w:jc w:val="center"/>
-            </w:pPr>
-            <w:r>
-              <w:rPr>
-                <w:rFonts w:ascii="Times New Roman" w:hAnsi="Times New Roman"/>
-                <w:sz w:val="26"/>
-                <w:rFonts w:ascii="Times New Roman" w:hAnsi="Times New Roman" w:cs="Times New Roman"/>
-              </w:rPr>
-              <w:t>20, 21</w:t>
-            </w:r>
-          </w:p>
-        </w:tc>
-        <w:tc>
-          <w:tcPr>
-            <w:tcW w:w="4253" w:type="dxa"/>
-          </w:tcPr>
-          <w:p>
-            <w:pPr>
-              <w:spacing w:before="20" w:after="20"/>
-            </w:pPr>
-            <w:r>
-              <w:rPr>
-                <w:rFonts w:ascii="Times New Roman" w:hAnsi="Times New Roman"/>
-                <w:sz w:val="26"/>
-                <w:rFonts w:ascii="Times New Roman" w:hAnsi="Times New Roman" w:cs="Times New Roman"/>
-              </w:rPr>
-              <w:t xml:space="preserve">- Định dạng dữ liệu số và trình bày bảng tính.  - Áp dụng các hàm (MAX, </w:t>
-            </w:r>
-            <w:r>
-              <w:rPr>
-                <w:rFonts w:ascii="Times New Roman" w:hAnsi="Times New Roman"/>
-                <w:sz w:val="26"/>
-                <w:rFonts w:ascii="Times New Roman" w:hAnsi="Times New Roman" w:cs="Times New Roman"/>
-              </w:rPr>
-              <w:lastRenderedPageBreak/>
-              <w:t>MIN, SUM, AVERAGE, COUNT) vào dự án Trường học xanh.</w:t>
-            </w:r>
-          </w:p>
-        </w:tc>
-      </w:tr>
-      <w:tr>
-        <w:tc>
-          <w:tcPr>
-            <w:tcW w:w="838" w:type="dxa"/>
-          </w:tcPr>
-          <w:p>
-            <w:pPr>
-              <w:spacing w:before="20" w:after="20"/>
-              <w:jc w:val="center"/>
-            </w:pPr>
-            <w:r>
-              <w:rPr>
-                <w:rFonts w:ascii="Times New Roman" w:hAnsi="Times New Roman"/>
-                <w:sz w:val="26"/>
-                <w:rFonts w:ascii="Times New Roman" w:hAnsi="Times New Roman" w:cs="Times New Roman"/>
-              </w:rPr>
-              <w:lastRenderedPageBreak/>
-              <w:t>18</w:t>
-            </w:r>
-          </w:p>
-        </w:tc>
-        <w:tc>
-          <w:tcPr>
-            <w:tcW w:w="3126" w:type="dxa"/>
-          </w:tcPr>
-          <w:p>
-            <w:pPr>
-              <w:spacing w:before="20" w:after="20"/>
-            </w:pPr>
-            <w:r>
-              <w:rPr>
-                <w:rFonts w:ascii="Times New Roman" w:hAnsi="Times New Roman"/>
-                <w:sz w:val="26"/>
-                <w:rFonts w:ascii="Times New Roman" w:hAnsi="Times New Roman" w:cs="Times New Roman"/>
-              </w:rPr>
-              <w:t>Bài 10. Hoàn thiện bảng tính</w:t>
-            </w:r>
-          </w:p>
-        </w:tc>
-        <w:tc>
-          <w:tcPr>
-            <w:tcW w:w="1134" w:type="dxa"/>
-          </w:tcPr>
-          <w:p>
-            <w:pPr>
-              <w:spacing w:before="20" w:after="20"/>
-              <w:jc w:val="center"/>
-            </w:pPr>
-            <w:r>
-              <w:rPr>
-                <w:rFonts w:ascii="Times New Roman" w:hAnsi="Times New Roman"/>
-                <w:sz w:val="26"/>
-                <w:rFonts w:ascii="Times New Roman" w:hAnsi="Times New Roman" w:cs="Times New Roman"/>
-              </w:rPr>
-              <w:t>22</w:t>
-            </w:r>
-          </w:p>
-        </w:tc>
-        <w:tc>
-          <w:tcPr>
-            <w:tcW w:w="4253" w:type="dxa"/>
-          </w:tcPr>
-          <w:p>
-            <w:pPr>
-              <w:spacing w:before="20" w:after="20"/>
-            </w:pPr>
-            <w:r>
-              <w:rPr>
-                <w:rFonts w:ascii="Times New Roman" w:hAnsi="Times New Roman"/>
-                <w:sz w:val="26"/>
-                <w:rFonts w:ascii="Times New Roman" w:hAnsi="Times New Roman" w:cs="Times New Roman"/>
-              </w:rPr>
-              <w:t>- Thao tác hoàn thiện và in bảng tính; thực hành hoàn thiện dự án.  - Sử dụng bảng tính điện tử giải quyết công việc cụ thể.</w:t>
-            </w:r>
-          </w:p>
-        </w:tc>
-      </w:tr>
-      <w:tr>
-        <w:tc>
-          <w:tcPr>
-            <w:tcW w:w="838" w:type="dxa"/>
-          </w:tcPr>
-          <w:p>
-            <w:pPr>
-              <w:spacing w:before="20" w:after="20"/>
-              <w:jc w:val="center"/>
-            </w:pPr>
-            <w:r>
-              <w:rPr>
-                <w:rFonts w:ascii="Times New Roman" w:hAnsi="Times New Roman"/>
-                <w:sz w:val="26"/>
-                <w:rFonts w:ascii="Times New Roman" w:hAnsi="Times New Roman" w:cs="Times New Roman"/>
-              </w:rPr>
-              <w:t>19</w:t>
-            </w:r>
-          </w:p>
-        </w:tc>
-        <w:tc>
-          <w:tcPr>
-            <w:tcW w:w="3126" w:type="dxa"/>
-          </w:tcPr>
-          <w:p>
-            <w:pPr>
-              <w:spacing w:before="20" w:after="20"/>
-            </w:pPr>
-            <w:r>
-              <w:rPr>
-                <w:rFonts w:ascii="Times New Roman" w:hAnsi="Times New Roman"/>
-                <w:sz w:val="26"/>
-                <w:rFonts w:ascii="Times New Roman" w:hAnsi="Times New Roman" w:cs="Times New Roman"/>
-              </w:rPr>
-              <w:t>Bài 11. Tạo bài trình chiếu</w:t>
-            </w:r>
-          </w:p>
-        </w:tc>
-        <w:tc>
-          <w:tcPr>
-            <w:tcW w:w="1134" w:type="dxa"/>
-          </w:tcPr>
-          <w:p>
-            <w:pPr>
-              <w:spacing w:before="20" w:after="20"/>
-              <w:jc w:val="center"/>
-            </w:pPr>
-            <w:r>
-              <w:rPr>
-                <w:rFonts w:ascii="Times New Roman" w:hAnsi="Times New Roman"/>
-                <w:sz w:val="26"/>
-                <w:rFonts w:ascii="Times New Roman" w:hAnsi="Times New Roman" w:cs="Times New Roman"/>
-              </w:rPr>
-              <w:t>23</w:t>
-            </w:r>
-          </w:p>
-        </w:tc>
-        <w:tc>
-          <w:tcPr>
-            <w:tcW w:w="4253" w:type="dxa"/>
-          </w:tcPr>
-          <w:p>
-            <w:pPr>
-              <w:spacing w:before="20" w:after="20"/>
-            </w:pPr>
-            <w:r>
-              <w:rPr>
-                <w:rFonts w:ascii="Times New Roman" w:hAnsi="Times New Roman"/>
-                <w:sz w:val="26"/>
-                <w:rFonts w:ascii="Times New Roman" w:hAnsi="Times New Roman" w:cs="Times New Roman"/>
-              </w:rPr>
-              <w:t>- Nêu chức năng cơ bản của phần mềm trình chiếu.  - Tạo bài trình chiếu có tiêu đề, cấu trúc phân cấp.</w:t>
-            </w:r>
-          </w:p>
-        </w:tc>
-      </w:tr>
-      <w:tr>
-        <w:tc>
-          <w:tcPr>
-            <w:tcW w:w="838" w:type="dxa"/>
-          </w:tcPr>
-          <w:p>
-            <w:pPr>
-              <w:spacing w:before="20" w:after="20"/>
-              <w:jc w:val="center"/>
-            </w:pPr>
-            <w:r>
-              <w:rPr>
-                <w:rFonts w:ascii="Times New Roman" w:hAnsi="Times New Roman"/>
-                <w:sz w:val="26"/>
-                <w:rFonts w:ascii="Times New Roman" w:hAnsi="Times New Roman" w:cs="Times New Roman"/>
-              </w:rPr>
-              <w:t>20</w:t>
-            </w:r>
-          </w:p>
-        </w:tc>
-        <w:tc>
-          <w:tcPr>
-            <w:tcW w:w="3126" w:type="dxa"/>
-          </w:tcPr>
-          <w:p>
-            <w:pPr>
-              <w:spacing w:before="20" w:after="20"/>
-            </w:pPr>
-            <w:r>
-              <w:rPr>
-                <w:rFonts w:ascii="Times New Roman" w:hAnsi="Times New Roman"/>
-                <w:sz w:val="26"/>
-                <w:rFonts w:ascii="Times New Roman" w:hAnsi="Times New Roman" w:cs="Times New Roman"/>
-              </w:rPr>
-              <w:t>Bài 12. Định dạng đối tượng trên trang chiếu</w:t>
-            </w:r>
-          </w:p>
-        </w:tc>
-        <w:tc>
-          <w:tcPr>
-            <w:tcW w:w="1134" w:type="dxa"/>
-          </w:tcPr>
-          <w:p>
-            <w:pPr>
-              <w:spacing w:before="20" w:after="20"/>
-              <w:jc w:val="center"/>
-            </w:pPr>
-            <w:r>
-              <w:rPr>
-                <w:rFonts w:ascii="Times New Roman" w:hAnsi="Times New Roman"/>
-                <w:sz w:val="26"/>
-                <w:rFonts w:ascii="Times New Roman" w:hAnsi="Times New Roman" w:cs="Times New Roman"/>
-              </w:rPr>
-              <w:t>24, 25</w:t>
-            </w:r>
-          </w:p>
-        </w:tc>
-        <w:tc>
-          <w:tcPr>
-            <w:tcW w:w="4253" w:type="dxa"/>
-          </w:tcPr>
-          <w:p>
-            <w:pPr>
-              <w:spacing w:before="20" w:after="20"/>
-            </w:pPr>
-            <w:r>
-              <w:rPr>
-                <w:rFonts w:ascii="Times New Roman" w:hAnsi="Times New Roman"/>
-                <w:sz w:val="26"/>
-                <w:rFonts w:ascii="Times New Roman" w:hAnsi="Times New Roman" w:cs="Times New Roman"/>
-              </w:rPr>
-              <w:t>- Sao chép dữ liệu từ tệp văn bản sang trang chiếu; chèn hình ảnh minh họa.  - Định dạng văn bản, ảnh minh họa hợp lý.</w:t>
-            </w:r>
-          </w:p>
-        </w:tc>
-      </w:tr>
-      <w:tr>
-        <w:tc>
-          <w:tcPr>
-            <w:tcW w:w="838" w:type="dxa"/>
-          </w:tcPr>
-          <w:p>
-            <w:pPr>
-              <w:spacing w:before="20" w:after="20"/>
-              <w:jc w:val="center"/>
-            </w:pPr>
-            <w:r>
-              <w:rPr>
-                <w:rFonts w:ascii="Times New Roman" w:hAnsi="Times New Roman"/>
-                <w:sz w:val="26"/>
-                <w:rFonts w:ascii="Times New Roman" w:hAnsi="Times New Roman" w:cs="Times New Roman"/>
-              </w:rPr>
-              <w:t>21</w:t>
-            </w:r>
-          </w:p>
-        </w:tc>
-        <w:tc>
-          <w:tcPr>
-            <w:tcW w:w="3126" w:type="dxa"/>
-          </w:tcPr>
-          <w:p>
-            <w:pPr>
-              <w:spacing w:before="20" w:after="20"/>
-            </w:pPr>
-            <w:r>
-              <w:rPr>
-                <w:rFonts w:ascii="Times New Roman" w:hAnsi="Times New Roman"/>
-                <w:sz w:val="26"/>
-                <w:rFonts w:ascii="Times New Roman" w:hAnsi="Times New Roman" w:cs="Times New Roman"/>
-              </w:rPr>
-              <w:t>Bài 13. Thực hành tổng hợp: Hoàn thiện bài trình chiếu</w:t>
-            </w:r>
-          </w:p>
-        </w:tc>
-        <w:tc>
-          <w:tcPr>
-            <w:tcW w:w="1134" w:type="dxa"/>
-          </w:tcPr>
-          <w:p>
-            <w:pPr>
-              <w:spacing w:before="20" w:after="20"/>
-              <w:jc w:val="center"/>
-            </w:pPr>
-            <w:r>
-              <w:rPr>
-                <w:rFonts w:ascii="Times New Roman" w:hAnsi="Times New Roman"/>
-                <w:sz w:val="26"/>
-                <w:rFonts w:ascii="Times New Roman" w:hAnsi="Times New Roman" w:cs="Times New Roman"/>
-              </w:rPr>
-              <w:t>26</w:t>
-            </w:r>
-          </w:p>
-        </w:tc>
-        <w:tc>
-          <w:tcPr>
-            <w:tcW w:w="4253" w:type="dxa"/>
-          </w:tcPr>
-          <w:p>
-            <w:pPr>
-              <w:spacing w:before="20" w:after="20"/>
-            </w:pPr>
-            <w:r>
-              <w:rPr>
-                <w:rFonts w:ascii="Times New Roman" w:hAnsi="Times New Roman"/>
-                <w:sz w:val="26"/>
-                <w:rFonts w:ascii="Times New Roman" w:hAnsi="Times New Roman" w:cs="Times New Roman"/>
-              </w:rPr>
-              <w:t>- Tạo hiệu ứng động hợp lý; tổng hợp, sắp xếp nội dung thành bài trình chiếu hoàn chỉnh.</w:t>
-            </w:r>
-          </w:p>
-        </w:tc>
-      </w:tr>
-      <w:tr>
-        <w:tc>
-          <w:tcPr>
-            <w:tcW w:w="838" w:type="dxa"/>
-          </w:tcPr>
-          <w:p>
-            <w:pPr>
-              <w:spacing w:before="20" w:after="20"/>
-              <w:jc w:val="center"/>
-            </w:pPr>
-            <w:r>
-              <w:rPr>
-                <w:rFonts w:ascii="Times New Roman" w:hAnsi="Times New Roman"/>
-                <w:b/>
-                <w:sz w:val="26"/>
-                <w:rFonts w:ascii="Times New Roman" w:hAnsi="Times New Roman" w:cs="Times New Roman"/>
-              </w:rPr>
-              <w:t>22</w:t>
-            </w:r>
-          </w:p>
-        </w:tc>
-        <w:tc>
-          <w:tcPr>
-            <w:tcW w:w="3126" w:type="dxa"/>
-          </w:tcPr>
-          <w:p>
-            <w:pPr>
-              <w:spacing w:before="20" w:after="20"/>
-            </w:pPr>
-            <w:r>
-              <w:rPr>
-                <w:rFonts w:ascii="Times New Roman" w:hAnsi="Times New Roman"/>
-                <w:b/>
-                <w:sz w:val="26"/>
-                <w:rFonts w:ascii="Times New Roman" w:hAnsi="Times New Roman" w:cs="Times New Roman"/>
-              </w:rPr>
-              <w:t>Ôn tập Đánh giá định kỳ 3</w:t>
-            </w:r>
-          </w:p>
-        </w:tc>
-        <w:tc>
-          <w:tcPr>
-            <w:tcW w:w="1134" w:type="dxa"/>
-          </w:tcPr>
-          <w:p>
-            <w:pPr>
-              <w:spacing w:before="20" w:after="20"/>
-              <w:jc w:val="center"/>
-            </w:pPr>
-            <w:r>
-              <w:rPr>
-                <w:rFonts w:ascii="Times New Roman" w:hAnsi="Times New Roman"/>
-                <w:b/>
-                <w:sz w:val="26"/>
-                <w:rFonts w:ascii="Times New Roman" w:hAnsi="Times New Roman" w:cs="Times New Roman"/>
-              </w:rPr>
-              <w:t>27</w:t>
-            </w:r>
-          </w:p>
-        </w:tc>
-        <w:tc>
-          <w:tcPr>
-            <w:tcW w:w="4253" w:type="dxa"/>
-          </w:tcPr>
-          <w:p>
-            <w:pPr>
-              <w:spacing w:before="20" w:after="20"/>
-            </w:pPr>
-            <w:r>
-              <w:rPr>
-                <w:rFonts w:ascii="Times New Roman" w:hAnsi="Times New Roman"/>
-                <w:sz w:val="26"/>
-                <w:rFonts w:ascii="Times New Roman" w:hAnsi="Times New Roman" w:cs="Times New Roman"/>
-              </w:rPr>
-              <w:t>Hệ thống hóa kiến thức chuẩn bị Đánh giá định kỳ 3.</w:t>
-            </w:r>
-          </w:p>
-        </w:tc>
-      </w:tr>
-      <w:tr>
-        <w:tc>
-          <w:tcPr>
-            <w:tcW w:w="838" w:type="dxa"/>
-          </w:tcPr>
-          <w:p>
-            <w:pPr>
-              <w:spacing w:before="20" w:after="20"/>
-              <w:jc w:val="center"/>
-            </w:pPr>
-            <w:r>
-              <w:rPr>
-                <w:rFonts w:ascii="Times New Roman" w:hAnsi="Times New Roman"/>
-                <w:b/>
-                <w:sz w:val="26"/>
-                <w:rFonts w:ascii="Times New Roman" w:hAnsi="Times New Roman" w:cs="Times New Roman"/>
-              </w:rPr>
-              <w:t>23</w:t>
-            </w:r>
-          </w:p>
-        </w:tc>
-        <w:tc>
-          <w:tcPr>
-            <w:tcW w:w="3126" w:type="dxa"/>
-          </w:tcPr>
-          <w:p>
-            <w:pPr>
-              <w:spacing w:before="20" w:after="20"/>
-            </w:pPr>
-            <w:r>
-              <w:rPr>
-                <w:rFonts w:ascii="Times New Roman" w:hAnsi="Times New Roman"/>
-                <w:b/>
-                <w:sz w:val="26"/>
-                <w:rFonts w:ascii="Times New Roman" w:hAnsi="Times New Roman" w:cs="Times New Roman"/>
-              </w:rPr>
-              <w:t>Đánh giá định kỳ 3</w:t>
-            </w:r>
-          </w:p>
-        </w:tc>
-        <w:tc>
-          <w:tcPr>
-            <w:tcW w:w="1134" w:type="dxa"/>
-          </w:tcPr>
-          <w:p>
-            <w:pPr>
-              <w:spacing w:before="20" w:after="20"/>
-              <w:jc w:val="center"/>
-            </w:pPr>
-            <w:r>
-              <w:rPr>
-                <w:rFonts w:ascii="Times New Roman" w:hAnsi="Times New Roman"/>
-                <w:b/>
-                <w:sz w:val="26"/>
-                <w:rFonts w:ascii="Times New Roman" w:hAnsi="Times New Roman" w:cs="Times New Roman"/>
-              </w:rPr>
-              <w:t>28</w:t>
-            </w:r>
-          </w:p>
-        </w:tc>
-        <w:tc>
-          <w:tcPr>
-            <w:tcW w:w="4253" w:type="dxa"/>
-          </w:tcPr>
-          <w:p>
-            <w:pPr>
-              <w:spacing w:before="20" w:after="20"/>
-            </w:pPr>
-            <w:r>
-              <w:rPr>
-                <w:rFonts w:ascii="Times New Roman" w:hAnsi="Times New Roman"/>
-                <w:sz w:val="26"/>
-                <w:rFonts w:ascii="Times New Roman" w:hAnsi="Times New Roman" w:cs="Times New Roman"/>
-              </w:rPr>
-              <w:t>Kiểm tra đánh giá kết quả học tập.</w:t>
-            </w:r>
-          </w:p>
-        </w:tc>
-      </w:tr>
-      <w:tr>
-        <w:tc>
-          <w:tcPr>
-            <w:tcW w:w="838" w:type="dxa"/>
-          </w:tcPr>
-          <w:p>
-            <w:pPr>
-              <w:spacing w:before="20" w:after="20"/>
-              <w:jc w:val="center"/>
-            </w:pPr>
-            <w:r>
-              <w:rPr>
-                <w:rFonts w:ascii="Times New Roman" w:hAnsi="Times New Roman"/>
-                <w:sz w:val="26"/>
-                <w:rFonts w:ascii="Times New Roman" w:hAnsi="Times New Roman" w:cs="Times New Roman"/>
-              </w:rPr>
-              <w:t>24</w:t>
-            </w:r>
-          </w:p>
-        </w:tc>
-        <w:tc>
-          <w:tcPr>
-            <w:tcW w:w="3126" w:type="dxa"/>
-          </w:tcPr>
-          <w:p>
-            <w:pPr>
-              <w:spacing w:before="20" w:after="20"/>
-            </w:pPr>
-            <w:r>
-              <w:rPr>
-                <w:rFonts w:ascii="Times New Roman" w:hAnsi="Times New Roman"/>
-                <w:sz w:val="26"/>
-                <w:rFonts w:ascii="Times New Roman" w:hAnsi="Times New Roman" w:cs="Times New Roman"/>
-              </w:rPr>
-              <w:t>Ôn tập và luyện tập</w:t>
-            </w:r>
-          </w:p>
-        </w:tc>
-        <w:tc>
-          <w:tcPr>
-            <w:tcW w:w="1134" w:type="dxa"/>
-          </w:tcPr>
-          <w:p>
-            <w:pPr>
-              <w:spacing w:before="20" w:after="20"/>
-              <w:jc w:val="center"/>
-            </w:pPr>
-            <w:r>
-              <w:rPr>
-                <w:rFonts w:ascii="Times New Roman" w:hAnsi="Times New Roman"/>
-                <w:sz w:val="26"/>
-                <w:rFonts w:ascii="Times New Roman" w:hAnsi="Times New Roman" w:cs="Times New Roman"/>
-              </w:rPr>
-              <w:t>29 - 32</w:t>
-            </w:r>
-          </w:p>
-        </w:tc>
-        <w:tc>
-          <w:tcPr>
-            <w:tcW w:w="4253" w:type="dxa"/>
-          </w:tcPr>
-          <w:p>
-            <w:pPr>
-              <w:spacing w:before="20" w:after="20"/>
-            </w:pPr>
-            <w:r>
-              <w:rPr>
-                <w:rFonts w:ascii="Times New Roman" w:hAnsi="Times New Roman"/>
-                <w:sz w:val="26"/>
-                <w:rFonts w:ascii="Times New Roman" w:hAnsi="Times New Roman" w:cs="Times New Roman"/>
-              </w:rPr>
-              <w:t>Ôn tập, luyện tập bổ sung kiến thức và kỹ năng.</w:t>
-            </w:r>
-          </w:p>
-        </w:tc>
-      </w:tr>
-      <w:tr>
-        <w:tc>
-          <w:tcPr>
-            <w:tcW w:w="838" w:type="dxa"/>
-          </w:tcPr>
-          <w:p>
-            <w:pPr>
-              <w:spacing w:before="20" w:after="20"/>
-              <w:jc w:val="center"/>
-            </w:pPr>
-            <w:r>
-              <w:rPr>
-                <w:rFonts w:ascii="Times New Roman" w:hAnsi="Times New Roman"/>
-                <w:b/>
-                <w:sz w:val="26"/>
-                <w:rFonts w:ascii="Times New Roman" w:hAnsi="Times New Roman" w:cs="Times New Roman"/>
-              </w:rPr>
-              <w:t>25</w:t>
-            </w:r>
-          </w:p>
-        </w:tc>
-        <w:tc>
-          <w:tcPr>
-            <w:tcW w:w="3126" w:type="dxa"/>
-          </w:tcPr>
-          <w:p>
-            <w:pPr>
-              <w:spacing w:before="20" w:after="20"/>
-            </w:pPr>
-            <w:r>
-              <w:rPr>
-                <w:rFonts w:ascii="Times New Roman" w:hAnsi="Times New Roman"/>
-                <w:b/>
-                <w:sz w:val="26"/>
-                <w:rFonts w:ascii="Times New Roman" w:hAnsi="Times New Roman" w:cs="Times New Roman"/>
-              </w:rPr>
-              <w:t>Ôn tập Đánh giá định kỳ 4</w:t>
-            </w:r>
-          </w:p>
-        </w:tc>
-        <w:tc>
-          <w:tcPr>
-            <w:tcW w:w="1134" w:type="dxa"/>
-          </w:tcPr>
-          <w:p>
-            <w:pPr>
-              <w:spacing w:before="20" w:after="20"/>
-              <w:jc w:val="center"/>
-            </w:pPr>
-            <w:r>
-              <w:rPr>
-                <w:rFonts w:ascii="Times New Roman" w:hAnsi="Times New Roman"/>
-                <w:b/>
-                <w:sz w:val="26"/>
-                <w:rFonts w:ascii="Times New Roman" w:hAnsi="Times New Roman" w:cs="Times New Roman"/>
-              </w:rPr>
-              <w:t>33</w:t>
-            </w:r>
-          </w:p>
-        </w:tc>
-        <w:tc>
-          <w:tcPr>
-            <w:tcW w:w="4253" w:type="dxa"/>
-          </w:tcPr>
-          <w:p>
-            <w:pPr>
-              <w:spacing w:before="20" w:after="20"/>
-            </w:pPr>
-            <w:r>
-              <w:rPr>
-                <w:rFonts w:ascii="Times New Roman" w:hAnsi="Times New Roman"/>
-                <w:sz w:val="26"/>
-                <w:rFonts w:ascii="Times New Roman" w:hAnsi="Times New Roman" w:cs="Times New Roman"/>
-              </w:rPr>
-              <w:t>Hệ thống hóa kiến thức chuẩn bị Đánh giá định kỳ 4.</w:t>
-            </w:r>
-          </w:p>
-        </w:tc>
-      </w:tr>
-      <w:tr>
-        <w:tc>
-          <w:tcPr>
-            <w:tcW w:w="838" w:type="dxa"/>
-          </w:tcPr>
-          <w:p>
-            <w:pPr>
-              <w:spacing w:before="20" w:after="20"/>
-              <w:jc w:val="center"/>
-            </w:pPr>
-            <w:r>
-              <w:rPr>
-                <w:rFonts w:ascii="Times New Roman" w:hAnsi="Times New Roman"/>
-                <w:b/>
-                <w:sz w:val="26"/>
-                <w:rFonts w:ascii="Times New Roman" w:hAnsi="Times New Roman" w:cs="Times New Roman"/>
-              </w:rPr>
-              <w:t>26</w:t>
-            </w:r>
-          </w:p>
-        </w:tc>
-        <w:tc>
-          <w:tcPr>
-            <w:tcW w:w="3126" w:type="dxa"/>
-          </w:tcPr>
-          <w:p>
-            <w:pPr>
-              <w:spacing w:before="20" w:after="20"/>
-            </w:pPr>
-            <w:r>
-              <w:rPr>
-                <w:rFonts w:ascii="Times New Roman" w:hAnsi="Times New Roman"/>
-                <w:b/>
-                <w:sz w:val="26"/>
-                <w:rFonts w:ascii="Times New Roman" w:hAnsi="Times New Roman" w:cs="Times New Roman"/>
-              </w:rPr>
-              <w:t>Đánh giá định kỳ 4</w:t>
-            </w:r>
-          </w:p>
-        </w:tc>
-        <w:tc>
-          <w:tcPr>
-            <w:tcW w:w="1134" w:type="dxa"/>
-          </w:tcPr>
-          <w:p>
-            <w:pPr>
-              <w:spacing w:before="20" w:after="20"/>
-              <w:jc w:val="center"/>
-            </w:pPr>
-            <w:r>
-              <w:rPr>
-                <w:rFonts w:ascii="Times New Roman" w:hAnsi="Times New Roman"/>
-                <w:b/>
-                <w:sz w:val="26"/>
-                <w:rFonts w:ascii="Times New Roman" w:hAnsi="Times New Roman" w:cs="Times New Roman"/>
-              </w:rPr>
-              <w:t>34</w:t>
-            </w:r>
-          </w:p>
-        </w:tc>
-        <w:tc>
-          <w:tcPr>
-            <w:tcW w:w="4253" w:type="dxa"/>
-          </w:tcPr>
-          <w:p>
-            <w:pPr>
-              <w:spacing w:before="20" w:after="20"/>
-            </w:pPr>
-            <w:r>
-              <w:rPr>
-                <w:rFonts w:ascii="Times New Roman" w:hAnsi="Times New Roman"/>
-                <w:sz w:val="26"/>
-                <w:rFonts w:ascii="Times New Roman" w:hAnsi="Times New Roman" w:cs="Times New Roman"/>
-              </w:rPr>
-              <w:t>Kiểm tra đánh giá kết quả học tập.</w:t>
-            </w:r>
-          </w:p>
-        </w:tc>
-      </w:tr>
-      <w:tr>
-        <w:tc>
-          <w:tcPr>
-            <w:tcW w:w="838" w:type="dxa"/>
-          </w:tcPr>
-          <w:p>
-            <w:pPr>
-              <w:spacing w:before="20" w:after="20"/>
-              <w:jc w:val="center"/>
-            </w:pPr>
-            <w:r>
-              <w:rPr>
-                <w:rFonts w:ascii="Times New Roman" w:hAnsi="Times New Roman"/>
-                <w:sz w:val="26"/>
-                <w:rFonts w:ascii="Times New Roman" w:hAnsi="Times New Roman" w:cs="Times New Roman"/>
-              </w:rPr>
-              <w:t>27</w:t>
-            </w:r>
-          </w:p>
-        </w:tc>
-        <w:tc>
-          <w:tcPr>
-            <w:tcW w:w="3126" w:type="dxa"/>
-          </w:tcPr>
-          <w:p>
-            <w:pPr>
-              <w:spacing w:before="20" w:after="20"/>
-            </w:pPr>
-            <w:r>
-              <w:rPr>
-                <w:rFonts w:ascii="Times New Roman" w:hAnsi="Times New Roman"/>
-                <w:sz w:val="26"/>
-                <w:rFonts w:ascii="Times New Roman" w:hAnsi="Times New Roman" w:cs="Times New Roman"/>
-              </w:rPr>
-              <w:t>Tổng kết năm học</w:t>
-            </w:r>
-          </w:p>
-        </w:tc>
-        <w:tc>
-          <w:tcPr>
-            <w:tcW w:w="1134" w:type="dxa"/>
-          </w:tcPr>
-          <w:p>
-            <w:pPr>
-              <w:spacing w:before="20" w:after="20"/>
-              <w:jc w:val="center"/>
-            </w:pPr>
-            <w:r>
-              <w:rPr>
-                <w:rFonts w:ascii="Times New Roman" w:hAnsi="Times New Roman"/>
-                <w:sz w:val="26"/>
-                <w:rFonts w:ascii="Times New Roman" w:hAnsi="Times New Roman" w:cs="Times New Roman"/>
-              </w:rPr>
-              <w:t>35</w:t>
-            </w:r>
-          </w:p>
-        </w:tc>
-        <w:tc>
-          <w:tcPr>
-            <w:tcW w:w="4253" w:type="dxa"/>
-          </w:tcPr>
-          <w:p>
-            <w:pPr>
-              <w:spacing w:before="20" w:after="20"/>
-            </w:pPr>
-            <w:r>
-              <w:rPr>
-                <w:rFonts w:ascii="Times New Roman" w:hAnsi="Times New Roman"/>
-                <w:sz w:val="26"/>
-                <w:rFonts w:ascii="Times New Roman" w:hAnsi="Times New Roman" w:cs="Times New Roman"/>
-              </w:rPr>
-              <w:t>Tổng kết đánh giá kết quả học tập cả năm.</w:t>
-            </w:r>
-          </w:p>
-        </w:tc>
-      </w:tr>
-    </w:tbl>
     <w:p>
       <w:pPr>
         <w:rPr>

</xml_diff>